<commit_message>
slides and report week 6 finished
</commit_message>
<xml_diff>
--- a/Documentation/Weekly Report/week6/CMSC-4920-Week6Report-Group2.docx
+++ b/Documentation/Weekly Report/week6/CMSC-4920-Week6Report-Group2.docx
@@ -914,7 +914,7 @@
             </w:rPr>
             <w:fldChar w:fldCharType="separate"/>
           </w:r>
-          <w:hyperlink w:anchor="_Toc222480169" w:history="1">
+          <w:hyperlink w:anchor="_Toc222642440" w:history="1">
             <w:r>
               <w:rPr>
                 <w:rStyle w:val="Hyperlink"/>
@@ -942,7 +942,7 @@
                 <w:noProof/>
                 <w:webHidden/>
               </w:rPr>
-              <w:instrText xml:space="preserve"> PAGEREF _Toc222480169 \h </w:instrText>
+              <w:instrText xml:space="preserve"> PAGEREF _Toc222642440 \h </w:instrText>
             </w:r>
             <w:r>
               <w:rPr>
@@ -984,7 +984,7 @@
               <w:noProof/>
             </w:rPr>
           </w:pPr>
-          <w:hyperlink w:anchor="_Toc222480170" w:history="1">
+          <w:hyperlink w:anchor="_Toc222642441" w:history="1">
             <w:r>
               <w:rPr>
                 <w:rStyle w:val="Hyperlink"/>
@@ -1012,7 +1012,7 @@
                 <w:noProof/>
                 <w:webHidden/>
               </w:rPr>
-              <w:instrText xml:space="preserve"> PAGEREF _Toc222480170 \h </w:instrText>
+              <w:instrText xml:space="preserve"> PAGEREF _Toc222642441 \h </w:instrText>
             </w:r>
             <w:r>
               <w:rPr>
@@ -1054,7 +1054,7 @@
               <w:noProof/>
             </w:rPr>
           </w:pPr>
-          <w:hyperlink w:anchor="_Toc222480171" w:history="1">
+          <w:hyperlink w:anchor="_Toc222642442" w:history="1">
             <w:r>
               <w:rPr>
                 <w:rStyle w:val="Hyperlink"/>
@@ -1082,7 +1082,7 @@
                 <w:noProof/>
                 <w:webHidden/>
               </w:rPr>
-              <w:instrText xml:space="preserve"> PAGEREF _Toc222480171 \h </w:instrText>
+              <w:instrText xml:space="preserve"> PAGEREF _Toc222642442 \h </w:instrText>
             </w:r>
             <w:r>
               <w:rPr>
@@ -1102,7 +1102,7 @@
                 <w:noProof/>
                 <w:webHidden/>
               </w:rPr>
-              <w:t>3</w:t>
+              <w:t>4</w:t>
             </w:r>
             <w:r>
               <w:rPr>
@@ -1124,7 +1124,7 @@
               <w:noProof/>
             </w:rPr>
           </w:pPr>
-          <w:hyperlink w:anchor="_Toc222480172" w:history="1">
+          <w:hyperlink w:anchor="_Toc222642443" w:history="1">
             <w:r>
               <w:rPr>
                 <w:rStyle w:val="Hyperlink"/>
@@ -1152,7 +1152,7 @@
                 <w:noProof/>
                 <w:webHidden/>
               </w:rPr>
-              <w:instrText xml:space="preserve"> PAGEREF _Toc222480172 \h </w:instrText>
+              <w:instrText xml:space="preserve"> PAGEREF _Toc222642443 \h </w:instrText>
             </w:r>
             <w:r>
               <w:rPr>
@@ -1172,7 +1172,7 @@
                 <w:noProof/>
                 <w:webHidden/>
               </w:rPr>
-              <w:t>3</w:t>
+              <w:t>4</w:t>
             </w:r>
             <w:r>
               <w:rPr>
@@ -1194,7 +1194,7 @@
               <w:noProof/>
             </w:rPr>
           </w:pPr>
-          <w:hyperlink w:anchor="_Toc222480173" w:history="1">
+          <w:hyperlink w:anchor="_Toc222642444" w:history="1">
             <w:r>
               <w:rPr>
                 <w:rStyle w:val="Hyperlink"/>
@@ -1222,7 +1222,7 @@
                 <w:noProof/>
                 <w:webHidden/>
               </w:rPr>
-              <w:instrText xml:space="preserve"> PAGEREF _Toc222480173 \h </w:instrText>
+              <w:instrText xml:space="preserve"> PAGEREF _Toc222642444 \h </w:instrText>
             </w:r>
             <w:r>
               <w:rPr>
@@ -1242,7 +1242,7 @@
                 <w:noProof/>
                 <w:webHidden/>
               </w:rPr>
-              <w:t>3</w:t>
+              <w:t>5</w:t>
             </w:r>
             <w:r>
               <w:rPr>
@@ -1264,7 +1264,7 @@
               <w:noProof/>
             </w:rPr>
           </w:pPr>
-          <w:hyperlink w:anchor="_Toc222480174" w:history="1">
+          <w:hyperlink w:anchor="_Toc222642445" w:history="1">
             <w:r>
               <w:rPr>
                 <w:rStyle w:val="Hyperlink"/>
@@ -1292,7 +1292,7 @@
                 <w:noProof/>
                 <w:webHidden/>
               </w:rPr>
-              <w:instrText xml:space="preserve"> PAGEREF _Toc222480174 \h </w:instrText>
+              <w:instrText xml:space="preserve"> PAGEREF _Toc222642445 \h </w:instrText>
             </w:r>
             <w:r>
               <w:rPr>
@@ -1312,7 +1312,7 @@
                 <w:noProof/>
                 <w:webHidden/>
               </w:rPr>
-              <w:t>4</w:t>
+              <w:t>6</w:t>
             </w:r>
             <w:r>
               <w:rPr>
@@ -1334,14 +1334,14 @@
               <w:noProof/>
             </w:rPr>
           </w:pPr>
-          <w:hyperlink w:anchor="_Toc222480175" w:history="1">
+          <w:hyperlink w:anchor="_Toc222642446" w:history="1">
             <w:r>
               <w:rPr>
                 <w:rStyle w:val="Hyperlink"/>
                 <w:rFonts w:ascii="Times New Roman" w:hAnsi="Times New Roman" w:cs="Times New Roman"/>
                 <w:noProof/>
               </w:rPr>
-              <w:t>Week 7 Plan:</w:t>
+              <w:t>Current Dashboard Progress:</w:t>
             </w:r>
             <w:r>
               <w:rPr>
@@ -1362,7 +1362,7 @@
                 <w:noProof/>
                 <w:webHidden/>
               </w:rPr>
-              <w:instrText xml:space="preserve"> PAGEREF _Toc222480175 \h </w:instrText>
+              <w:instrText xml:space="preserve"> PAGEREF _Toc222642446 \h </w:instrText>
             </w:r>
             <w:r>
               <w:rPr>
@@ -1382,7 +1382,7 @@
                 <w:noProof/>
                 <w:webHidden/>
               </w:rPr>
-              <w:t>5</w:t>
+              <w:t>6</w:t>
             </w:r>
             <w:r>
               <w:rPr>
@@ -1404,13 +1404,83 @@
               <w:noProof/>
             </w:rPr>
           </w:pPr>
-          <w:hyperlink w:anchor="_Toc222480176" w:history="1">
+          <w:hyperlink w:anchor="_Toc222642447" w:history="1">
             <w:r>
               <w:rPr>
                 <w:rStyle w:val="Hyperlink"/>
                 <w:rFonts w:ascii="Times New Roman" w:hAnsi="Times New Roman" w:cs="Times New Roman"/>
                 <w:noProof/>
               </w:rPr>
+              <w:t>Week 7 Plan:</w:t>
+            </w:r>
+            <w:r>
+              <w:rPr>
+                <w:noProof/>
+                <w:webHidden/>
+              </w:rPr>
+              <w:tab/>
+            </w:r>
+            <w:r>
+              <w:rPr>
+                <w:noProof/>
+                <w:webHidden/>
+              </w:rPr>
+              <w:fldChar w:fldCharType="begin"/>
+            </w:r>
+            <w:r>
+              <w:rPr>
+                <w:noProof/>
+                <w:webHidden/>
+              </w:rPr>
+              <w:instrText xml:space="preserve"> PAGEREF _Toc222642447 \h </w:instrText>
+            </w:r>
+            <w:r>
+              <w:rPr>
+                <w:noProof/>
+                <w:webHidden/>
+              </w:rPr>
+            </w:r>
+            <w:r>
+              <w:rPr>
+                <w:noProof/>
+                <w:webHidden/>
+              </w:rPr>
+              <w:fldChar w:fldCharType="separate"/>
+            </w:r>
+            <w:r>
+              <w:rPr>
+                <w:noProof/>
+                <w:webHidden/>
+              </w:rPr>
+              <w:t>7</w:t>
+            </w:r>
+            <w:r>
+              <w:rPr>
+                <w:noProof/>
+                <w:webHidden/>
+              </w:rPr>
+              <w:fldChar w:fldCharType="end"/>
+            </w:r>
+          </w:hyperlink>
+        </w:p>
+        <w:p>
+          <w:pPr>
+            <w:pStyle w:val="TOC1"/>
+            <w:tabs>
+              <w:tab w:val="right" w:leader="dot" w:pos="9350"/>
+            </w:tabs>
+            <w:rPr>
+              <w:rFonts w:eastAsiaTheme="minorEastAsia"/>
+              <w:noProof/>
+            </w:rPr>
+          </w:pPr>
+          <w:hyperlink w:anchor="_Toc222642448" w:history="1">
+            <w:r>
+              <w:rPr>
+                <w:rStyle w:val="Hyperlink"/>
+                <w:rFonts w:ascii="Times New Roman" w:hAnsi="Times New Roman" w:cs="Times New Roman"/>
+                <w:noProof/>
+              </w:rPr>
               <w:t>Member Contribution:</w:t>
             </w:r>
             <w:r>
@@ -1432,7 +1502,7 @@
                 <w:noProof/>
                 <w:webHidden/>
               </w:rPr>
-              <w:instrText xml:space="preserve"> PAGEREF _Toc222480176 \h </w:instrText>
+              <w:instrText xml:space="preserve"> PAGEREF _Toc222642448 \h </w:instrText>
             </w:r>
             <w:r>
               <w:rPr>
@@ -1452,7 +1522,7 @@
                 <w:noProof/>
                 <w:webHidden/>
               </w:rPr>
-              <w:t>6</w:t>
+              <w:t>8</w:t>
             </w:r>
             <w:r>
               <w:rPr>
@@ -1502,7 +1572,7 @@
           <w:szCs w:val="24"/>
         </w:rPr>
       </w:pPr>
-      <w:bookmarkStart w:id="0" w:name="_Toc222480169"/>
+      <w:bookmarkStart w:id="0" w:name="_Toc222642440"/>
       <w:r>
         <w:rPr>
           <w:rFonts w:ascii="Times New Roman" w:hAnsi="Times New Roman" w:cs="Times New Roman"/>
@@ -1655,7 +1725,7 @@
           <w:szCs w:val="24"/>
         </w:rPr>
       </w:pPr>
-      <w:bookmarkStart w:id="1" w:name="_Toc222480170"/>
+      <w:bookmarkStart w:id="1" w:name="_Toc222642441"/>
       <w:r>
         <w:rPr>
           <w:rFonts w:ascii="Times New Roman" w:hAnsi="Times New Roman" w:cs="Times New Roman"/>
@@ -1699,7 +1769,19 @@
         <w:rPr>
           <w:rFonts w:ascii="Times New Roman" w:hAnsi="Times New Roman" w:cs="Times New Roman"/>
         </w:rPr>
-        <w:t xml:space="preserve">friends’ public account information. Users can view top current activities and view clubs that their friends are members of. Additionally, users can show feedback in two unique ways! </w:t>
+        <w:t xml:space="preserve">friends’ public account information. Users can view top </w:t>
+      </w:r>
+      <w:r>
+        <w:rPr>
+          <w:rFonts w:ascii="Times New Roman" w:hAnsi="Times New Roman" w:cs="Times New Roman"/>
+        </w:rPr>
+        <w:t xml:space="preserve">ten </w:t>
+      </w:r>
+      <w:r>
+        <w:rPr>
+          <w:rFonts w:ascii="Times New Roman" w:hAnsi="Times New Roman" w:cs="Times New Roman"/>
+        </w:rPr>
+        <w:t xml:space="preserve">current activities and view clubs that their friends are members of. Additionally, users can show feedback in two unique ways! </w:t>
       </w:r>
       <w:r>
         <w:rPr>
@@ -1742,6 +1824,37 @@
           <w:rFonts w:ascii="Times New Roman" w:hAnsi="Times New Roman" w:cs="Times New Roman"/>
         </w:rPr>
         <w:t xml:space="preserve"> This enables privacy for app users and encourages a wider audience of students that may not want to appear publicly.</w:t>
+      </w:r>
+      <w:r>
+        <w:rPr>
+          <w:rFonts w:ascii="Times New Roman" w:hAnsi="Times New Roman" w:cs="Times New Roman"/>
+        </w:rPr>
+        <w:t xml:space="preserve"> We were able to correct the existing bug that set all activities to public by default this week as well. Through debugging, it was found that </w:t>
+      </w:r>
+      <w:r>
+        <w:rPr>
+          <w:rFonts w:ascii="Times New Roman" w:hAnsi="Times New Roman" w:cs="Times New Roman"/>
+        </w:rPr>
+        <w:t xml:space="preserve">the radio buttons that allow for public or private selection was only created as an html element, but </w:t>
+      </w:r>
+      <w:r>
+        <w:rPr>
+          <w:rFonts w:ascii="Times New Roman" w:hAnsi="Times New Roman" w:cs="Times New Roman"/>
+        </w:rPr>
+        <w:lastRenderedPageBreak/>
+        <w:t>there was no existing JavaScript logic wired to “listen” for a change. We were able to add this logic once identifying the issue</w:t>
+      </w:r>
+      <w:r>
+        <w:rPr>
+          <w:rFonts w:ascii="Times New Roman" w:hAnsi="Times New Roman" w:cs="Times New Roman"/>
+        </w:rPr>
+        <w:t xml:space="preserve">. Activities now store in the database properly as public or private in the </w:t>
+      </w:r>
+      <w:r>
+        <w:rPr>
+          <w:rFonts w:ascii="Times New Roman" w:hAnsi="Times New Roman" w:cs="Times New Roman"/>
+        </w:rPr>
+        <w:t>visibility column.</w:t>
       </w:r>
     </w:p>
     <w:p>
@@ -1792,14 +1905,7 @@
         <w:rPr>
           <w:rFonts w:ascii="Times New Roman" w:hAnsi="Times New Roman" w:cs="Times New Roman"/>
         </w:rPr>
-        <w:t xml:space="preserve">. </w:t>
-      </w:r>
-      <w:r>
-        <w:rPr>
-          <w:rFonts w:ascii="Times New Roman" w:hAnsi="Times New Roman" w:cs="Times New Roman"/>
-        </w:rPr>
-        <w:lastRenderedPageBreak/>
-        <w:t>A user’s password must be at least 8 characters long and contain an uppercase letter</w:t>
+        <w:t>. A user’s password must be at least 8 characters long and contain an uppercase letter</w:t>
       </w:r>
       <w:r>
         <w:rPr>
@@ -1931,25 +2037,31 @@
         <w:rPr>
           <w:rFonts w:ascii="Times New Roman" w:hAnsi="Times New Roman" w:cs="Times New Roman"/>
         </w:rPr>
-        <w:t>One of the most important goals</w:t>
-      </w:r>
-      <w:r>
-        <w:rPr>
-          <w:rFonts w:ascii="Times New Roman" w:hAnsi="Times New Roman" w:cs="Times New Roman"/>
-        </w:rPr>
-        <w:t xml:space="preserve"> and final goal</w:t>
-      </w:r>
-      <w:r>
-        <w:rPr>
-          <w:rFonts w:ascii="Times New Roman" w:hAnsi="Times New Roman" w:cs="Times New Roman"/>
-        </w:rPr>
-        <w:t xml:space="preserve"> for this week was </w:t>
-      </w:r>
-      <w:r>
-        <w:rPr>
-          <w:rFonts w:ascii="Times New Roman" w:hAnsi="Times New Roman" w:cs="Times New Roman"/>
-        </w:rPr>
-        <w:t>to begin the team pages.</w:t>
+        <w:t>Several other features were clean up and</w:t>
+      </w:r>
+      <w:r>
+        <w:rPr>
+          <w:rFonts w:ascii="Times New Roman" w:hAnsi="Times New Roman" w:cs="Times New Roman"/>
+        </w:rPr>
+        <w:t>/</w:t>
+      </w:r>
+      <w:r>
+        <w:rPr>
+          <w:rFonts w:ascii="Times New Roman" w:hAnsi="Times New Roman" w:cs="Times New Roman"/>
+        </w:rPr>
+        <w:t xml:space="preserve">or added this week that fall into the category of minor front-end changes. For example, clubs that a user is a member of were finally displayed on the user’s dashboard panel. Here, name of club and overall member count can be </w:t>
+      </w:r>
+      <w:r>
+        <w:rPr>
+          <w:rFonts w:ascii="Times New Roman" w:hAnsi="Times New Roman" w:cs="Times New Roman"/>
+        </w:rPr>
+        <w:t xml:space="preserve">seen when mouse is hovered over. Another minor change was the </w:t>
+      </w:r>
+      <w:r>
+        <w:rPr>
+          <w:rFonts w:ascii="Times New Roman" w:hAnsi="Times New Roman" w:cs="Times New Roman"/>
+        </w:rPr>
+        <w:t>moving of leaderboard filters for clear navigation.</w:t>
       </w:r>
     </w:p>
     <w:p>
@@ -1958,10 +2070,165 @@
         <w:ind w:firstLine="720"/>
         <w:rPr>
           <w:rFonts w:ascii="Times New Roman" w:hAnsi="Times New Roman" w:cs="Times New Roman"/>
-          <w:b/>
-          <w:bCs/>
-        </w:rPr>
-      </w:pPr>
+        </w:rPr>
+      </w:pPr>
+      <w:r>
+        <w:rPr>
+          <w:rFonts w:ascii="Times New Roman" w:hAnsi="Times New Roman" w:cs="Times New Roman"/>
+        </w:rPr>
+        <w:lastRenderedPageBreak/>
+        <w:t>T</w:t>
+      </w:r>
+      <w:r>
+        <w:rPr>
+          <w:rFonts w:ascii="Times New Roman" w:hAnsi="Times New Roman" w:cs="Times New Roman"/>
+        </w:rPr>
+        <w:t xml:space="preserve">he </w:t>
+      </w:r>
+      <w:r>
+        <w:rPr>
+          <w:rFonts w:ascii="Times New Roman" w:hAnsi="Times New Roman" w:cs="Times New Roman"/>
+        </w:rPr>
+        <w:t xml:space="preserve">overall </w:t>
+      </w:r>
+      <w:r>
+        <w:rPr>
+          <w:rFonts w:ascii="Times New Roman" w:hAnsi="Times New Roman" w:cs="Times New Roman"/>
+        </w:rPr>
+        <w:t xml:space="preserve">most important </w:t>
+      </w:r>
+      <w:r>
+        <w:rPr>
+          <w:rFonts w:ascii="Times New Roman" w:hAnsi="Times New Roman" w:cs="Times New Roman"/>
+        </w:rPr>
+        <w:t>and final goal</w:t>
+      </w:r>
+      <w:r>
+        <w:rPr>
+          <w:rFonts w:ascii="Times New Roman" w:hAnsi="Times New Roman" w:cs="Times New Roman"/>
+        </w:rPr>
+        <w:t>s</w:t>
+      </w:r>
+      <w:r>
+        <w:rPr>
+          <w:rFonts w:ascii="Times New Roman" w:hAnsi="Times New Roman" w:cs="Times New Roman"/>
+        </w:rPr>
+        <w:t xml:space="preserve"> for this week </w:t>
+      </w:r>
+      <w:r>
+        <w:rPr>
+          <w:rFonts w:ascii="Times New Roman" w:hAnsi="Times New Roman" w:cs="Times New Roman"/>
+        </w:rPr>
+        <w:t>were</w:t>
+      </w:r>
+      <w:r>
+        <w:rPr>
+          <w:rFonts w:ascii="Times New Roman" w:hAnsi="Times New Roman" w:cs="Times New Roman"/>
+        </w:rPr>
+        <w:t xml:space="preserve"> </w:t>
+      </w:r>
+      <w:r>
+        <w:rPr>
+          <w:rFonts w:ascii="Times New Roman" w:hAnsi="Times New Roman" w:cs="Times New Roman"/>
+        </w:rPr>
+        <w:t>to begin</w:t>
+      </w:r>
+      <w:r>
+        <w:rPr>
+          <w:rFonts w:ascii="Times New Roman" w:hAnsi="Times New Roman" w:cs="Times New Roman"/>
+        </w:rPr>
+        <w:t xml:space="preserve"> both</w:t>
+      </w:r>
+      <w:r>
+        <w:rPr>
+          <w:rFonts w:ascii="Times New Roman" w:hAnsi="Times New Roman" w:cs="Times New Roman"/>
+        </w:rPr>
+        <w:t xml:space="preserve"> the team pages</w:t>
+      </w:r>
+      <w:r>
+        <w:rPr>
+          <w:rFonts w:ascii="Times New Roman" w:hAnsi="Times New Roman" w:cs="Times New Roman"/>
+        </w:rPr>
+        <w:t xml:space="preserve"> and the challenges pages. These two components allow our team to maintain on track with our Gantt chart.</w:t>
+      </w:r>
+      <w:r>
+        <w:rPr>
+          <w:rFonts w:ascii="Times New Roman" w:hAnsi="Times New Roman" w:cs="Times New Roman"/>
+        </w:rPr>
+        <w:t xml:space="preserve"> </w:t>
+      </w:r>
+      <w:r>
+        <w:rPr>
+          <w:rFonts w:ascii="Times New Roman" w:hAnsi="Times New Roman" w:cs="Times New Roman"/>
+        </w:rPr>
+        <w:t xml:space="preserve">The Teams page represents official university team sports. It allows users to view </w:t>
+      </w:r>
+      <w:r>
+        <w:rPr>
+          <w:rFonts w:ascii="Times New Roman" w:hAnsi="Times New Roman" w:cs="Times New Roman"/>
+        </w:rPr>
+        <w:t xml:space="preserve">teams and members of teams. Ideally, coaches would serve as managers to the </w:t>
+      </w:r>
+      <w:r>
+        <w:rPr>
+          <w:rFonts w:ascii="Times New Roman" w:hAnsi="Times New Roman" w:cs="Times New Roman"/>
+        </w:rPr>
+        <w:t xml:space="preserve">team </w:t>
+      </w:r>
+      <w:r>
+        <w:rPr>
+          <w:rFonts w:ascii="Times New Roman" w:hAnsi="Times New Roman" w:cs="Times New Roman"/>
+        </w:rPr>
+        <w:t xml:space="preserve">member lists or another approved member. The challenges page </w:t>
+      </w:r>
+      <w:r>
+        <w:rPr>
+          <w:rFonts w:ascii="Times New Roman" w:hAnsi="Times New Roman" w:cs="Times New Roman"/>
+        </w:rPr>
+        <w:t>adds another fun interactive feature for users. A user can pick from existing challenges to participate in or create a new one available to all site users. These challenges can be step</w:t>
+      </w:r>
+      <w:r>
+        <w:rPr>
+          <w:rFonts w:ascii="Times New Roman" w:hAnsi="Times New Roman" w:cs="Times New Roman"/>
+        </w:rPr>
+        <w:t xml:space="preserve">, </w:t>
+      </w:r>
+      <w:r>
+        <w:rPr>
+          <w:rFonts w:ascii="Times New Roman" w:hAnsi="Times New Roman" w:cs="Times New Roman"/>
+        </w:rPr>
+        <w:t>mile</w:t>
+      </w:r>
+      <w:r>
+        <w:rPr>
+          <w:rFonts w:ascii="Times New Roman" w:hAnsi="Times New Roman" w:cs="Times New Roman"/>
+        </w:rPr>
+        <w:t>,</w:t>
+      </w:r>
+      <w:r>
+        <w:rPr>
+          <w:rFonts w:ascii="Times New Roman" w:hAnsi="Times New Roman" w:cs="Times New Roman"/>
+        </w:rPr>
+        <w:t xml:space="preserve"> </w:t>
+      </w:r>
+      <w:r>
+        <w:rPr>
+          <w:rFonts w:ascii="Times New Roman" w:hAnsi="Times New Roman" w:cs="Times New Roman"/>
+        </w:rPr>
+        <w:t>point</w:t>
+      </w:r>
+      <w:r>
+        <w:rPr>
+          <w:rFonts w:ascii="Times New Roman" w:hAnsi="Times New Roman" w:cs="Times New Roman"/>
+        </w:rPr>
+        <w:t xml:space="preserve"> goals</w:t>
+      </w:r>
+      <w:r>
+        <w:rPr>
+          <w:rFonts w:ascii="Times New Roman" w:hAnsi="Times New Roman" w:cs="Times New Roman"/>
+        </w:rPr>
+        <w:t>, etc... Both Team and Challenges features require significant development time in the upcoming week.</w:t>
+      </w:r>
     </w:p>
     <w:p>
       <w:pPr>
@@ -1975,7 +2242,7 @@
           <w:szCs w:val="24"/>
         </w:rPr>
       </w:pPr>
-      <w:bookmarkStart w:id="2" w:name="_Toc222480171"/>
+      <w:bookmarkStart w:id="2" w:name="_Toc222642442"/>
       <w:r>
         <w:rPr>
           <w:rFonts w:ascii="Times New Roman" w:hAnsi="Times New Roman" w:cs="Times New Roman"/>
@@ -2057,7 +2324,19 @@
         <w:rPr>
           <w:rFonts w:ascii="Times New Roman" w:hAnsi="Times New Roman" w:cs="Times New Roman"/>
         </w:rPr>
-        <w:t xml:space="preserve">Challenge One was found in </w:t>
+        <w:t>Challenge One was</w:t>
+      </w:r>
+      <w:r>
+        <w:rPr>
+          <w:rFonts w:ascii="Times New Roman" w:hAnsi="Times New Roman" w:cs="Times New Roman"/>
+        </w:rPr>
+        <w:t>e</w:t>
+      </w:r>
+      <w:r>
+        <w:rPr>
+          <w:rFonts w:ascii="Times New Roman" w:hAnsi="Times New Roman" w:cs="Times New Roman"/>
+        </w:rPr>
+        <w:t xml:space="preserve"> found in </w:t>
       </w:r>
       <w:r>
         <w:rPr>
@@ -2081,12 +2360,6 @@
         <w:rPr>
           <w:rFonts w:ascii="Times New Roman" w:hAnsi="Times New Roman" w:cs="Times New Roman"/>
         </w:rPr>
-        <w:t xml:space="preserve"> the</w:t>
-      </w:r>
-      <w:r>
-        <w:rPr>
-          <w:rFonts w:ascii="Times New Roman" w:hAnsi="Times New Roman" w:cs="Times New Roman"/>
-        </w:rPr>
         <w:t xml:space="preserve"> </w:t>
       </w:r>
       <w:r>
@@ -2106,6 +2379,60 @@
           <w:rFonts w:ascii="Times New Roman" w:hAnsi="Times New Roman" w:cs="Times New Roman"/>
         </w:rPr>
         <w:t xml:space="preserve">Activity Like, the same logic could not be directly reused. </w:t>
+      </w:r>
+    </w:p>
+    <w:p>
+      <w:pPr>
+        <w:spacing w:line="480" w:lineRule="auto"/>
+        <w:ind w:firstLine="720"/>
+        <w:rPr>
+          <w:rFonts w:ascii="Times New Roman" w:hAnsi="Times New Roman" w:cs="Times New Roman"/>
+        </w:rPr>
+      </w:pPr>
+      <w:r>
+        <w:rPr>
+          <w:rFonts w:ascii="Times New Roman" w:hAnsi="Times New Roman" w:cs="Times New Roman"/>
+        </w:rPr>
+        <w:t xml:space="preserve">2. </w:t>
+      </w:r>
+      <w:r>
+        <w:rPr>
+          <w:rFonts w:ascii="Times New Roman" w:hAnsi="Times New Roman" w:cs="Times New Roman"/>
+        </w:rPr>
+        <w:t>Radio Buttons were</w:t>
+      </w:r>
+      <w:r>
+        <w:rPr>
+          <w:rFonts w:ascii="Times New Roman" w:hAnsi="Times New Roman" w:cs="Times New Roman"/>
+        </w:rPr>
+        <w:t xml:space="preserve"> found to be only initialized but no logic connected them </w:t>
+      </w:r>
+      <w:r>
+        <w:rPr>
+          <w:rFonts w:ascii="Times New Roman" w:hAnsi="Times New Roman" w:cs="Times New Roman"/>
+        </w:rPr>
+        <w:t>to function properly.</w:t>
+      </w:r>
+    </w:p>
+    <w:p>
+      <w:pPr>
+        <w:spacing w:line="480" w:lineRule="auto"/>
+        <w:ind w:firstLine="720"/>
+        <w:rPr>
+          <w:rFonts w:ascii="Times New Roman" w:hAnsi="Times New Roman" w:cs="Times New Roman"/>
+        </w:rPr>
+      </w:pPr>
+      <w:r>
+        <w:rPr>
+          <w:rFonts w:ascii="Times New Roman" w:hAnsi="Times New Roman" w:cs="Times New Roman"/>
+        </w:rPr>
+        <w:t xml:space="preserve">3. Another challenge of this week was finding a solution to viewing activities both on the friend and user features. Once many activities were stored the list became so long and </w:t>
+      </w:r>
+      <w:r>
+        <w:rPr>
+          <w:rFonts w:ascii="Times New Roman" w:hAnsi="Times New Roman" w:cs="Times New Roman"/>
+        </w:rPr>
+        <w:t xml:space="preserve">resulted in a strange UI effect. </w:t>
       </w:r>
     </w:p>
     <w:p>
@@ -2120,7 +2447,7 @@
           <w:szCs w:val="24"/>
         </w:rPr>
       </w:pPr>
-      <w:bookmarkStart w:id="3" w:name="_Toc222480172"/>
+      <w:bookmarkStart w:id="3" w:name="_Toc222642443"/>
       <w:r>
         <w:rPr>
           <w:rFonts w:ascii="Times New Roman" w:hAnsi="Times New Roman" w:cs="Times New Roman"/>
@@ -2136,6 +2463,202 @@
     </w:p>
     <w:p>
       <w:pPr>
+        <w:spacing w:line="480" w:lineRule="auto"/>
+        <w:ind w:firstLine="720"/>
+        <w:rPr>
+          <w:rFonts w:ascii="Times New Roman" w:hAnsi="Times New Roman" w:cs="Times New Roman"/>
+        </w:rPr>
+      </w:pPr>
+      <w:r>
+        <w:rPr>
+          <w:rFonts w:ascii="Times New Roman" w:hAnsi="Times New Roman" w:cs="Times New Roman"/>
+        </w:rPr>
+        <w:t xml:space="preserve">1. </w:t>
+      </w:r>
+      <w:r>
+        <w:rPr>
+          <w:rFonts w:ascii="Times New Roman" w:hAnsi="Times New Roman" w:cs="Times New Roman"/>
+        </w:rPr>
+        <w:t xml:space="preserve">To solve the Like count separation problem, a new database table was created called Activity Like. This </w:t>
+      </w:r>
+      <w:r>
+        <w:rPr>
+          <w:rFonts w:ascii="Times New Roman" w:hAnsi="Times New Roman" w:cs="Times New Roman"/>
+        </w:rPr>
+        <w:t xml:space="preserve">ensured the </w:t>
+      </w:r>
+      <w:r>
+        <w:rPr>
+          <w:rFonts w:ascii="Times New Roman" w:hAnsi="Times New Roman" w:cs="Times New Roman"/>
+        </w:rPr>
+        <w:t>separa</w:t>
+      </w:r>
+      <w:r>
+        <w:rPr>
+          <w:rFonts w:ascii="Times New Roman" w:hAnsi="Times New Roman" w:cs="Times New Roman"/>
+        </w:rPr>
+        <w:t xml:space="preserve">tion of Profile Likes and Activity Likes. Similar logic could then be reused </w:t>
+      </w:r>
+      <w:r>
+        <w:rPr>
+          <w:rFonts w:ascii="Times New Roman" w:hAnsi="Times New Roman" w:cs="Times New Roman"/>
+        </w:rPr>
+        <w:t xml:space="preserve">in the Activity Like API. First a like button is </w:t>
+      </w:r>
+      <w:r>
+        <w:rPr>
+          <w:rFonts w:ascii="Times New Roman" w:hAnsi="Times New Roman" w:cs="Times New Roman"/>
+        </w:rPr>
+        <w:t xml:space="preserve">sent the existing number of like counts, this shows that the button is active. Next. It is </w:t>
+      </w:r>
+      <w:r>
+        <w:rPr>
+          <w:rFonts w:ascii="Times New Roman" w:hAnsi="Times New Roman" w:cs="Times New Roman"/>
+        </w:rPr>
+        <w:t>checked if it has already been clicked</w:t>
+      </w:r>
+      <w:r>
+        <w:rPr>
+          <w:rFonts w:ascii="Times New Roman" w:hAnsi="Times New Roman" w:cs="Times New Roman"/>
+        </w:rPr>
+        <w:t xml:space="preserve"> by the user viewing it, if so, the user cannot click it again. However, if it has not been clicked, </w:t>
+      </w:r>
+      <w:r>
+        <w:rPr>
+          <w:rFonts w:ascii="Times New Roman" w:hAnsi="Times New Roman" w:cs="Times New Roman"/>
+        </w:rPr>
+        <w:lastRenderedPageBreak/>
+        <w:t>the user can use the like button, and their status is then sent across the API and stored in the database for future reference.</w:t>
+      </w:r>
+      <w:r>
+        <w:rPr>
+          <w:rFonts w:ascii="Times New Roman" w:hAnsi="Times New Roman" w:cs="Times New Roman"/>
+        </w:rPr>
+        <w:t xml:space="preserve"> </w:t>
+      </w:r>
+    </w:p>
+    <w:p>
+      <w:pPr>
+        <w:spacing w:line="480" w:lineRule="auto"/>
+        <w:ind w:firstLine="720"/>
+        <w:rPr>
+          <w:rFonts w:ascii="Times New Roman" w:hAnsi="Times New Roman" w:cs="Times New Roman"/>
+        </w:rPr>
+      </w:pPr>
+      <w:r>
+        <w:rPr>
+          <w:rFonts w:ascii="Times New Roman" w:hAnsi="Times New Roman" w:cs="Times New Roman"/>
+        </w:rPr>
+        <w:t xml:space="preserve">2. </w:t>
+      </w:r>
+      <w:r>
+        <w:rPr>
+          <w:rFonts w:ascii="Times New Roman" w:hAnsi="Times New Roman" w:cs="Times New Roman"/>
+        </w:rPr>
+        <w:t xml:space="preserve">Since our platform has 2 radio buttons to determine public or private </w:t>
+      </w:r>
+      <w:r>
+        <w:rPr>
+          <w:rFonts w:ascii="Times New Roman" w:hAnsi="Times New Roman" w:cs="Times New Roman"/>
+        </w:rPr>
+        <w:t xml:space="preserve">activity data, we had to make sure that our logic checked both buttons. A disconnect in the logic was found to check the radio buttons once, never detecting the change between states, treating them as one button. These radio buttons had to be added to </w:t>
+      </w:r>
+      <w:r>
+        <w:rPr>
+          <w:rFonts w:ascii="Times New Roman" w:hAnsi="Times New Roman" w:cs="Times New Roman"/>
+        </w:rPr>
+        <w:t>the JavaScript event handler to allow for the “listening” of changed state. With corrected logic, th</w:t>
+      </w:r>
+      <w:r>
+        <w:rPr>
+          <w:rFonts w:ascii="Times New Roman" w:hAnsi="Times New Roman" w:cs="Times New Roman"/>
+        </w:rPr>
+        <w:t>is feature now works properly and stores activities as either public or private based on what the user selects.</w:t>
+      </w:r>
+    </w:p>
+    <w:p>
+      <w:pPr>
+        <w:spacing w:line="480" w:lineRule="auto"/>
+        <w:ind w:firstLine="720"/>
+        <w:rPr>
+          <w:rFonts w:ascii="Times New Roman" w:hAnsi="Times New Roman" w:cs="Times New Roman"/>
+        </w:rPr>
+      </w:pPr>
+      <w:r>
+        <w:rPr>
+          <w:rFonts w:ascii="Times New Roman" w:hAnsi="Times New Roman" w:cs="Times New Roman"/>
+        </w:rPr>
+        <w:t xml:space="preserve">3. </w:t>
+      </w:r>
+      <w:r>
+        <w:rPr>
+          <w:rFonts w:ascii="Times New Roman" w:hAnsi="Times New Roman" w:cs="Times New Roman"/>
+        </w:rPr>
+        <w:t xml:space="preserve">Through group and class </w:t>
+      </w:r>
+      <w:r>
+        <w:rPr>
+          <w:rFonts w:ascii="Times New Roman" w:hAnsi="Times New Roman" w:cs="Times New Roman"/>
+        </w:rPr>
+        <w:t>decisions</w:t>
+      </w:r>
+      <w:r>
+        <w:rPr>
+          <w:rFonts w:ascii="Times New Roman" w:hAnsi="Times New Roman" w:cs="Times New Roman"/>
+        </w:rPr>
+        <w:t xml:space="preserve"> it was thought to be best to display the top ten </w:t>
+      </w:r>
+      <w:r>
+        <w:rPr>
+          <w:rFonts w:ascii="Times New Roman" w:hAnsi="Times New Roman" w:cs="Times New Roman"/>
+        </w:rPr>
+        <w:t>activi</w:t>
+      </w:r>
+      <w:r>
+        <w:rPr>
+          <w:rFonts w:ascii="Times New Roman" w:hAnsi="Times New Roman" w:cs="Times New Roman"/>
+        </w:rPr>
+        <w:t xml:space="preserve">ties for the dashboard ands friend view. This keeps the UI </w:t>
+      </w:r>
+      <w:r>
+        <w:rPr>
+          <w:rFonts w:ascii="Times New Roman" w:hAnsi="Times New Roman" w:cs="Times New Roman"/>
+        </w:rPr>
+        <w:t>uniform</w:t>
+      </w:r>
+      <w:r>
+        <w:rPr>
+          <w:rFonts w:ascii="Times New Roman" w:hAnsi="Times New Roman" w:cs="Times New Roman"/>
+        </w:rPr>
+        <w:t xml:space="preserve"> and doesn’t overload the page view. </w:t>
+      </w:r>
+      <w:r>
+        <w:rPr>
+          <w:rFonts w:ascii="Times New Roman" w:hAnsi="Times New Roman" w:cs="Times New Roman"/>
+        </w:rPr>
+        <w:t>If a user wants to view full history, they must access it through the designated activity page.</w:t>
+      </w:r>
+      <w:r>
+        <w:rPr>
+          <w:rFonts w:ascii="Times New Roman" w:hAnsi="Times New Roman" w:cs="Times New Roman"/>
+        </w:rPr>
+        <w:t xml:space="preserve"> Activities are now sorted into top ten list by choosing the </w:t>
+      </w:r>
+      <w:r>
+        <w:rPr>
+          <w:rFonts w:ascii="Times New Roman" w:hAnsi="Times New Roman" w:cs="Times New Roman"/>
+        </w:rPr>
+        <w:t>newest dates entered to keep the data current. The overall list is sorted then sliced into slots 0-9</w:t>
+      </w:r>
+      <w:r>
+        <w:rPr>
+          <w:rFonts w:ascii="Times New Roman" w:hAnsi="Times New Roman" w:cs="Times New Roman"/>
+        </w:rPr>
+        <w:t>. This ensures that every time a user views their activities they are looking at up to date information.</w:t>
+      </w:r>
+    </w:p>
+    <w:p>
+      <w:pPr>
         <w:pStyle w:val="Heading1"/>
         <w:rPr>
           <w:rFonts w:ascii="Times New Roman" w:hAnsi="Times New Roman" w:cs="Times New Roman"/>
@@ -2146,7 +2669,7 @@
           <w:szCs w:val="24"/>
         </w:rPr>
       </w:pPr>
-      <w:bookmarkStart w:id="4" w:name="_Toc222480173"/>
+      <w:bookmarkStart w:id="4" w:name="_Toc222642444"/>
       <w:r>
         <w:rPr>
           <w:rFonts w:ascii="Times New Roman" w:hAnsi="Times New Roman" w:cs="Times New Roman"/>
@@ -2184,50 +2707,50 @@
         <w:rPr>
           <w:rFonts w:ascii="Times New Roman" w:hAnsi="Times New Roman" w:cs="Times New Roman"/>
         </w:rPr>
-        <w:t xml:space="preserve">Week 6 transformed the Vulcan Activity Tracker from concept to </w:t>
+        <w:t xml:space="preserve">Week 6 transformed the Vulcan Activity Tracker from concept to actuality. </w:t>
+      </w:r>
+      <w:r>
+        <w:rPr>
+          <w:rFonts w:ascii="Times New Roman" w:hAnsi="Times New Roman" w:cs="Times New Roman"/>
+        </w:rPr>
+        <w:t xml:space="preserve">Almost all main components have been initialized or are under development. As progress continues, our team is able to make modifications based on </w:t>
+      </w:r>
+      <w:r>
+        <w:rPr>
+          <w:rFonts w:ascii="Times New Roman" w:hAnsi="Times New Roman" w:cs="Times New Roman"/>
+        </w:rPr>
+        <w:t xml:space="preserve">usability experience and what we feel makes the most sense with users in mind. Each team member provides valuable contributions in debugging, development, and brainstorming. </w:t>
+      </w:r>
+      <w:r>
+        <w:rPr>
+          <w:rFonts w:ascii="Times New Roman" w:hAnsi="Times New Roman" w:cs="Times New Roman"/>
+        </w:rPr>
+        <w:t xml:space="preserve">While we feel that we are currently on track with our Gantt chart, some components are not at the current status we would like them to be at. For example, our team proposed </w:t>
+      </w:r>
+      <w:r>
+        <w:rPr>
+          <w:rFonts w:ascii="Times New Roman" w:hAnsi="Times New Roman" w:cs="Times New Roman"/>
+        </w:rPr>
+        <w:t xml:space="preserve">in previous reports </w:t>
+      </w:r>
+      <w:r>
+        <w:rPr>
+          <w:rFonts w:ascii="Times New Roman" w:hAnsi="Times New Roman" w:cs="Times New Roman"/>
+        </w:rPr>
+        <w:t xml:space="preserve">to be further along with </w:t>
+      </w:r>
+      <w:r>
+        <w:rPr>
+          <w:rFonts w:ascii="Times New Roman" w:hAnsi="Times New Roman" w:cs="Times New Roman"/>
+        </w:rPr>
+        <w:t xml:space="preserve">the Teams, </w:t>
       </w:r>
       <w:r>
         <w:rPr>
           <w:rFonts w:ascii="Times New Roman" w:hAnsi="Times New Roman" w:cs="Times New Roman"/>
         </w:rPr>
         <w:lastRenderedPageBreak/>
-        <w:t xml:space="preserve">actuality. </w:t>
-      </w:r>
-      <w:r>
-        <w:rPr>
-          <w:rFonts w:ascii="Times New Roman" w:hAnsi="Times New Roman" w:cs="Times New Roman"/>
-        </w:rPr>
-        <w:t xml:space="preserve">Almost all main components have been initialized or are under development. As progress continues, our team is able to make modifications based on </w:t>
-      </w:r>
-      <w:r>
-        <w:rPr>
-          <w:rFonts w:ascii="Times New Roman" w:hAnsi="Times New Roman" w:cs="Times New Roman"/>
-        </w:rPr>
-        <w:t xml:space="preserve">usability experience and what we feel makes the most sense with users in mind. Each team member provides valuable contributions in debugging, development, and brainstorming. </w:t>
-      </w:r>
-      <w:r>
-        <w:rPr>
-          <w:rFonts w:ascii="Times New Roman" w:hAnsi="Times New Roman" w:cs="Times New Roman"/>
-        </w:rPr>
-        <w:t xml:space="preserve">While we feel that we are currently on track with our Gantt chart, some components are not at the current status we would like them to be at. For example, our team proposed </w:t>
-      </w:r>
-      <w:r>
-        <w:rPr>
-          <w:rFonts w:ascii="Times New Roman" w:hAnsi="Times New Roman" w:cs="Times New Roman"/>
-        </w:rPr>
-        <w:t xml:space="preserve">in previous reports </w:t>
-      </w:r>
-      <w:r>
-        <w:rPr>
-          <w:rFonts w:ascii="Times New Roman" w:hAnsi="Times New Roman" w:cs="Times New Roman"/>
-        </w:rPr>
-        <w:t xml:space="preserve">to be further along with </w:t>
-      </w:r>
-      <w:r>
-        <w:rPr>
-          <w:rFonts w:ascii="Times New Roman" w:hAnsi="Times New Roman" w:cs="Times New Roman"/>
-        </w:rPr>
-        <w:t>the Teams, Maps, and Challenges Pages.</w:t>
+        <w:t>Maps, and Challenges Pages.</w:t>
       </w:r>
       <w:r>
         <w:rPr>
@@ -2291,7 +2814,7 @@
           <w:szCs w:val="24"/>
         </w:rPr>
       </w:pPr>
-      <w:bookmarkStart w:id="5" w:name="_Toc222480174"/>
+      <w:bookmarkStart w:id="5" w:name="_Toc222642445"/>
       <w:r>
         <w:rPr>
           <w:rFonts w:ascii="Times New Roman" w:hAnsi="Times New Roman" w:cs="Times New Roman"/>
@@ -2372,18 +2895,8 @@
     </w:p>
     <w:p>
       <w:pPr>
-        <w:spacing w:line="480" w:lineRule="auto"/>
-        <w:jc w:val="both"/>
-        <w:rPr>
-          <w:rFonts w:ascii="Times New Roman" w:hAnsi="Times New Roman" w:cs="Times New Roman"/>
-          <w:b/>
-          <w:bCs/>
-        </w:rPr>
-      </w:pPr>
-    </w:p>
-    <w:p>
-      <w:pPr>
         <w:pStyle w:val="Heading1"/>
+        <w:jc w:val="center"/>
         <w:rPr>
           <w:rFonts w:ascii="Times New Roman" w:hAnsi="Times New Roman" w:cs="Times New Roman"/>
           <w:b/>
@@ -2393,7 +2906,7 @@
           <w:szCs w:val="24"/>
         </w:rPr>
       </w:pPr>
-      <w:bookmarkStart w:id="6" w:name="_Toc222480175"/>
+      <w:bookmarkStart w:id="6" w:name="_Toc222642446"/>
       <w:r>
         <w:rPr>
           <w:rFonts w:ascii="Times New Roman" w:hAnsi="Times New Roman" w:cs="Times New Roman"/>
@@ -2403,10 +2916,86 @@
           <w:sz w:val="24"/>
           <w:szCs w:val="24"/>
         </w:rPr>
-        <w:lastRenderedPageBreak/>
-        <w:t xml:space="preserve">Week </w:t>
-      </w:r>
-      <w:r>
+        <w:t>Current Dashboard Progress:</w:t>
+      </w:r>
+      <w:bookmarkEnd w:id="6"/>
+    </w:p>
+    <w:p>
+      <w:pPr>
+        <w:spacing w:line="480" w:lineRule="auto"/>
+        <w:jc w:val="center"/>
+        <w:rPr>
+          <w:rFonts w:ascii="Times New Roman" w:hAnsi="Times New Roman" w:cs="Times New Roman"/>
+          <w:b/>
+          <w:bCs/>
+        </w:rPr>
+      </w:pPr>
+      <w:r>
+        <w:rPr>
+          <w:rFonts w:ascii="Times New Roman" w:hAnsi="Times New Roman" w:cs="Times New Roman"/>
+          <w:b/>
+          <w:bCs/>
+        </w:rPr>
+        <w:drawing>
+          <wp:inline distT="0" distB="0" distL="0" distR="0" wp14:anchorId="0D90401C" wp14:editId="00AE6632">
+            <wp:extent cx="6051861" cy="2033270"/>
+            <wp:effectExtent l="19050" t="19050" r="25400" b="24130"/>
+            <wp:docPr id="807559421" name="Picture 4">
+              <a:extLst xmlns:a="http://schemas.openxmlformats.org/drawingml/2006/main">
+                <a:ext uri="{FF2B5EF4-FFF2-40B4-BE49-F238E27FC236}">
+                  <a16:creationId xmlns:a16="http://schemas.microsoft.com/office/drawing/2014/main" id="{6C01547A-003F-2DA0-1CB8-4E92D18977A2}"/>
+                </a:ext>
+              </a:extLst>
+            </wp:docPr>
+            <wp:cNvGraphicFramePr>
+              <a:graphicFrameLocks xmlns:a="http://schemas.openxmlformats.org/drawingml/2006/main" noChangeAspect="1"/>
+            </wp:cNvGraphicFramePr>
+            <a:graphic xmlns:a="http://schemas.openxmlformats.org/drawingml/2006/main">
+              <a:graphicData uri="http://schemas.openxmlformats.org/drawingml/2006/picture">
+                <pic:pic xmlns:pic="http://schemas.openxmlformats.org/drawingml/2006/picture">
+                  <pic:nvPicPr>
+                    <pic:cNvPr id="5" name="Picture 4">
+                      <a:extLst>
+                        <a:ext uri="{FF2B5EF4-FFF2-40B4-BE49-F238E27FC236}">
+                          <a16:creationId xmlns:a16="http://schemas.microsoft.com/office/drawing/2014/main" id="{6C01547A-003F-2DA0-1CB8-4E92D18977A2}"/>
+                        </a:ext>
+                      </a:extLst>
+                    </pic:cNvPr>
+                    <pic:cNvPicPr>
+                      <a:picLocks noChangeAspect="1"/>
+                    </pic:cNvPicPr>
+                  </pic:nvPicPr>
+                  <pic:blipFill>
+                    <a:blip r:embed="rId12"/>
+                    <a:srcRect b="2997"/>
+                    <a:stretch>
+                      <a:fillRect/>
+                    </a:stretch>
+                  </pic:blipFill>
+                  <pic:spPr>
+                    <a:xfrm>
+                      <a:off x="0" y="0"/>
+                      <a:ext cx="6078004" cy="2042053"/>
+                    </a:xfrm>
+                    <a:prstGeom prst="rect">
+                      <a:avLst/>
+                    </a:prstGeom>
+                    <a:ln>
+                      <a:solidFill>
+                        <a:schemeClr val="tx1"/>
+                      </a:solidFill>
+                    </a:ln>
+                  </pic:spPr>
+                </pic:pic>
+              </a:graphicData>
+            </a:graphic>
+          </wp:inline>
+        </w:drawing>
+      </w:r>
+    </w:p>
+    <w:p>
+      <w:pPr>
+        <w:pStyle w:val="Heading1"/>
         <w:rPr>
           <w:rFonts w:ascii="Times New Roman" w:hAnsi="Times New Roman" w:cs="Times New Roman"/>
           <w:b/>
@@ -2415,8 +3004,8 @@
           <w:sz w:val="24"/>
           <w:szCs w:val="24"/>
         </w:rPr>
-        <w:t>7</w:t>
-      </w:r>
+      </w:pPr>
+      <w:bookmarkStart w:id="7" w:name="_Toc222642447"/>
       <w:r>
         <w:rPr>
           <w:rFonts w:ascii="Times New Roman" w:hAnsi="Times New Roman" w:cs="Times New Roman"/>
@@ -2426,7 +3015,8 @@
           <w:sz w:val="24"/>
           <w:szCs w:val="24"/>
         </w:rPr>
-        <w:t xml:space="preserve"> </w:t>
+        <w:lastRenderedPageBreak/>
+        <w:t xml:space="preserve">Week </w:t>
       </w:r>
       <w:r>
         <w:rPr>
@@ -2437,97 +3027,9 @@
           <w:sz w:val="24"/>
           <w:szCs w:val="24"/>
         </w:rPr>
-        <w:t>Plan:</w:t>
-      </w:r>
-      <w:bookmarkEnd w:id="6"/>
-    </w:p>
-    <w:p>
-      <w:pPr>
-        <w:spacing w:line="480" w:lineRule="auto"/>
-        <w:ind w:firstLine="720"/>
-        <w:rPr>
-          <w:rFonts w:ascii="Times New Roman" w:hAnsi="Times New Roman" w:cs="Times New Roman"/>
-        </w:rPr>
-      </w:pPr>
-      <w:r>
-        <w:rPr>
-          <w:rFonts w:ascii="Times New Roman" w:hAnsi="Times New Roman" w:cs="Times New Roman"/>
-        </w:rPr>
-        <w:t xml:space="preserve">During week 7, our team proposes to </w:t>
-      </w:r>
-      <w:r>
-        <w:rPr>
-          <w:rFonts w:ascii="Times New Roman" w:hAnsi="Times New Roman" w:cs="Times New Roman"/>
-        </w:rPr>
-        <w:t xml:space="preserve">allot time to check current programming progress against last semester’s documentation. </w:t>
-      </w:r>
-      <w:r>
-        <w:rPr>
-          <w:rFonts w:ascii="Times New Roman" w:hAnsi="Times New Roman" w:cs="Times New Roman"/>
-        </w:rPr>
-        <w:t xml:space="preserve">This is to ensure that our goals are aligned with previous proposals and requirements are being met. Additionally, overall testing and debugging will commence to ensure that as we move towards later steps in </w:t>
-      </w:r>
-      <w:r>
-        <w:rPr>
-          <w:rFonts w:ascii="Times New Roman" w:hAnsi="Times New Roman" w:cs="Times New Roman"/>
-        </w:rPr>
-        <w:t>development,</w:t>
-      </w:r>
-      <w:r>
-        <w:rPr>
-          <w:rFonts w:ascii="Times New Roman" w:hAnsi="Times New Roman" w:cs="Times New Roman"/>
-        </w:rPr>
-        <w:t xml:space="preserve"> we don’t have residual bugs and issues carrying along into the phase of development. </w:t>
-      </w:r>
-      <w:r>
-        <w:rPr>
-          <w:rFonts w:ascii="Times New Roman" w:hAnsi="Times New Roman" w:cs="Times New Roman"/>
-        </w:rPr>
-        <w:t xml:space="preserve">We have identified that our team additionally needs to hold a meeting for initial </w:t>
-      </w:r>
-      <w:r>
-        <w:rPr>
-          <w:rFonts w:ascii="Times New Roman" w:hAnsi="Times New Roman" w:cs="Times New Roman"/>
-        </w:rPr>
-        <w:t xml:space="preserve">impressions and testing with users outside of our development team. These beta testers were previously </w:t>
-      </w:r>
-      <w:r>
-        <w:rPr>
-          <w:rFonts w:ascii="Times New Roman" w:hAnsi="Times New Roman" w:cs="Times New Roman"/>
-        </w:rPr>
-        <w:t xml:space="preserve">chosen last semester in documentation, and they will be reached out to participate in this scheduled team meeting. </w:t>
-      </w:r>
-      <w:r>
-        <w:rPr>
-          <w:rFonts w:ascii="Times New Roman" w:hAnsi="Times New Roman" w:cs="Times New Roman"/>
-        </w:rPr>
-        <w:t xml:space="preserve">We propose that week </w:t>
-      </w:r>
-      <w:r>
-        <w:rPr>
-          <w:rFonts w:ascii="Times New Roman" w:hAnsi="Times New Roman" w:cs="Times New Roman"/>
-        </w:rPr>
         <w:t>7</w:t>
       </w:r>
       <w:r>
-        <w:rPr>
-          <w:rFonts w:ascii="Times New Roman" w:hAnsi="Times New Roman" w:cs="Times New Roman"/>
-        </w:rPr>
-        <w:t xml:space="preserve"> will be a productive week to move our project a step closer to the end goal!</w:t>
-      </w:r>
-    </w:p>
-    <w:p>
-      <w:pPr>
-        <w:spacing w:line="480" w:lineRule="auto"/>
-        <w:rPr>
-          <w:rFonts w:ascii="Times New Roman" w:hAnsi="Times New Roman" w:cs="Times New Roman"/>
-        </w:rPr>
-      </w:pPr>
-    </w:p>
-    <w:p>
-      <w:pPr>
-        <w:pStyle w:val="Heading1"/>
-        <w:jc w:val="center"/>
         <w:rPr>
           <w:rFonts w:ascii="Times New Roman" w:hAnsi="Times New Roman" w:cs="Times New Roman"/>
           <w:b/>
@@ -2536,17 +3038,8 @@
           <w:sz w:val="24"/>
           <w:szCs w:val="24"/>
         </w:rPr>
-      </w:pPr>
-      <w:r>
-        <w:rPr>
-          <w:rFonts w:ascii="Times New Roman" w:hAnsi="Times New Roman" w:cs="Times New Roman"/>
-          <w:color w:val="auto"/>
-          <w:sz w:val="24"/>
-          <w:szCs w:val="24"/>
-        </w:rPr>
-        <w:br w:type="page"/>
-      </w:r>
-      <w:bookmarkStart w:id="7" w:name="_Toc222480176"/>
+        <w:t xml:space="preserve"> </w:t>
+      </w:r>
       <w:r>
         <w:rPr>
           <w:rFonts w:ascii="Times New Roman" w:hAnsi="Times New Roman" w:cs="Times New Roman"/>
@@ -2556,10 +3049,129 @@
           <w:sz w:val="24"/>
           <w:szCs w:val="24"/>
         </w:rPr>
+        <w:t>Plan:</w:t>
+      </w:r>
+      <w:bookmarkEnd w:id="7"/>
+    </w:p>
+    <w:p>
+      <w:pPr>
+        <w:spacing w:line="480" w:lineRule="auto"/>
+        <w:ind w:firstLine="720"/>
+        <w:rPr>
+          <w:rFonts w:ascii="Times New Roman" w:hAnsi="Times New Roman" w:cs="Times New Roman"/>
+        </w:rPr>
+      </w:pPr>
+      <w:r>
+        <w:rPr>
+          <w:rFonts w:ascii="Times New Roman" w:hAnsi="Times New Roman" w:cs="Times New Roman"/>
+        </w:rPr>
+        <w:t xml:space="preserve">During week 7, our team proposes to </w:t>
+      </w:r>
+      <w:r>
+        <w:rPr>
+          <w:rFonts w:ascii="Times New Roman" w:hAnsi="Times New Roman" w:cs="Times New Roman"/>
+        </w:rPr>
+        <w:t xml:space="preserve">allot time to check current programming progress against last semester’s documentation. </w:t>
+      </w:r>
+      <w:r>
+        <w:rPr>
+          <w:rFonts w:ascii="Times New Roman" w:hAnsi="Times New Roman" w:cs="Times New Roman"/>
+        </w:rPr>
+        <w:t xml:space="preserve">This is to ensure that our goals are aligned with previous proposals and requirements are being met. Additionally, overall testing and debugging will commence to ensure that as we move towards later steps in </w:t>
+      </w:r>
+      <w:r>
+        <w:rPr>
+          <w:rFonts w:ascii="Times New Roman" w:hAnsi="Times New Roman" w:cs="Times New Roman"/>
+        </w:rPr>
+        <w:t>development,</w:t>
+      </w:r>
+      <w:r>
+        <w:rPr>
+          <w:rFonts w:ascii="Times New Roman" w:hAnsi="Times New Roman" w:cs="Times New Roman"/>
+        </w:rPr>
+        <w:t xml:space="preserve"> we don’t have residual bugs and issues carrying along into the phase of development. </w:t>
+      </w:r>
+      <w:r>
+        <w:rPr>
+          <w:rFonts w:ascii="Times New Roman" w:hAnsi="Times New Roman" w:cs="Times New Roman"/>
+        </w:rPr>
+        <w:t xml:space="preserve">We have identified that our team additionally needs to hold a meeting for initial </w:t>
+      </w:r>
+      <w:r>
+        <w:rPr>
+          <w:rFonts w:ascii="Times New Roman" w:hAnsi="Times New Roman" w:cs="Times New Roman"/>
+        </w:rPr>
+        <w:t xml:space="preserve">impressions and testing with users outside of our development team. These beta testers were previously </w:t>
+      </w:r>
+      <w:r>
+        <w:rPr>
+          <w:rFonts w:ascii="Times New Roman" w:hAnsi="Times New Roman" w:cs="Times New Roman"/>
+        </w:rPr>
+        <w:t xml:space="preserve">chosen last semester in documentation, and they will be reached out to participate in this scheduled team meeting. </w:t>
+      </w:r>
+      <w:r>
+        <w:rPr>
+          <w:rFonts w:ascii="Times New Roman" w:hAnsi="Times New Roman" w:cs="Times New Roman"/>
+        </w:rPr>
+        <w:t xml:space="preserve">We propose that week </w:t>
+      </w:r>
+      <w:r>
+        <w:rPr>
+          <w:rFonts w:ascii="Times New Roman" w:hAnsi="Times New Roman" w:cs="Times New Roman"/>
+        </w:rPr>
+        <w:t>7</w:t>
+      </w:r>
+      <w:r>
+        <w:rPr>
+          <w:rFonts w:ascii="Times New Roman" w:hAnsi="Times New Roman" w:cs="Times New Roman"/>
+        </w:rPr>
+        <w:t xml:space="preserve"> will be a productive week to move our project a step closer to the end goal!</w:t>
+      </w:r>
+    </w:p>
+    <w:p>
+      <w:pPr>
+        <w:spacing w:line="480" w:lineRule="auto"/>
+        <w:rPr>
+          <w:rFonts w:ascii="Times New Roman" w:hAnsi="Times New Roman" w:cs="Times New Roman"/>
+        </w:rPr>
+      </w:pPr>
+    </w:p>
+    <w:p>
+      <w:pPr>
+        <w:pStyle w:val="Heading1"/>
+        <w:jc w:val="center"/>
+        <w:rPr>
+          <w:rFonts w:ascii="Times New Roman" w:hAnsi="Times New Roman" w:cs="Times New Roman"/>
+          <w:b/>
+          <w:bCs/>
+          <w:color w:val="auto"/>
+          <w:sz w:val="24"/>
+          <w:szCs w:val="24"/>
+        </w:rPr>
+      </w:pPr>
+      <w:r>
+        <w:rPr>
+          <w:rFonts w:ascii="Times New Roman" w:hAnsi="Times New Roman" w:cs="Times New Roman"/>
+          <w:color w:val="auto"/>
+          <w:sz w:val="24"/>
+          <w:szCs w:val="24"/>
+        </w:rPr>
+        <w:br w:type="page"/>
+      </w:r>
+      <w:bookmarkStart w:id="8" w:name="_Toc222642448"/>
+      <w:r>
+        <w:rPr>
+          <w:rFonts w:ascii="Times New Roman" w:hAnsi="Times New Roman" w:cs="Times New Roman"/>
+          <w:b/>
+          <w:bCs/>
+          <w:color w:val="auto"/>
+          <w:sz w:val="24"/>
+          <w:szCs w:val="24"/>
+        </w:rPr>
         <w:lastRenderedPageBreak/>
         <w:t>Member Contribution:</w:t>
       </w:r>
-      <w:bookmarkEnd w:id="7"/>
+      <w:bookmarkEnd w:id="8"/>
     </w:p>
     <w:p/>
     <w:tbl>
@@ -2692,6 +3304,18 @@
               </w:rPr>
               <w:t>, complete Friends feature</w:t>
             </w:r>
+            <w:r>
+              <w:rPr>
+                <w:rFonts w:ascii="Times New Roman" w:hAnsi="Times New Roman" w:cs="Times New Roman"/>
+              </w:rPr>
+              <w:t>, Dashboard changes</w:t>
+            </w:r>
+            <w:r>
+              <w:rPr>
+                <w:rFonts w:ascii="Times New Roman" w:hAnsi="Times New Roman" w:cs="Times New Roman"/>
+              </w:rPr>
+              <w:t>, clubs view on dashboard</w:t>
+            </w:r>
           </w:p>
           <w:p>
             <w:pPr>
@@ -2765,7 +3389,19 @@
               <w:rPr>
                 <w:rFonts w:ascii="Times New Roman" w:hAnsi="Times New Roman" w:cs="Times New Roman"/>
               </w:rPr>
-              <w:t>Team meetings, Week 6 Report &amp; Slides, Leaderboard page progress</w:t>
+              <w:t>Team meetings, Week 6 Report &amp; Slides, Leaderboard page</w:t>
+            </w:r>
+            <w:r>
+              <w:rPr>
+                <w:rFonts w:ascii="Times New Roman" w:hAnsi="Times New Roman" w:cs="Times New Roman"/>
+              </w:rPr>
+              <w:t>, Teams Page</w:t>
+            </w:r>
+            <w:r>
+              <w:rPr>
+                <w:rFonts w:ascii="Times New Roman" w:hAnsi="Times New Roman" w:cs="Times New Roman"/>
+              </w:rPr>
+              <w:t>, Login changes</w:t>
             </w:r>
           </w:p>
           <w:p>
@@ -2855,7 +3491,13 @@
               <w:rPr>
                 <w:rFonts w:ascii="Times New Roman" w:hAnsi="Times New Roman" w:cs="Times New Roman"/>
               </w:rPr>
-              <w:t xml:space="preserve"> Report &amp; Slides, Clubs page progress</w:t>
+              <w:t xml:space="preserve"> Report &amp; Slides, Clubs page</w:t>
+            </w:r>
+            <w:r>
+              <w:rPr>
+                <w:rFonts w:ascii="Times New Roman" w:hAnsi="Times New Roman" w:cs="Times New Roman"/>
+              </w:rPr>
+              <w:t>, Challenges page</w:t>
             </w:r>
           </w:p>
           <w:p>
@@ -2926,7 +3568,7 @@
       </w:pPr>
     </w:p>
     <w:sectPr>
-      <w:footerReference w:type="default" r:id="rId12"/>
+      <w:footerReference w:type="default" r:id="rId13"/>
       <w:pgSz w:w="12240" w:h="15840"/>
       <w:pgMar w:top="1440" w:right="1440" w:bottom="1440" w:left="1440" w:header="720" w:footer="720" w:gutter="0"/>
       <w:pgBorders w:display="firstPage" w:offsetFrom="page">
@@ -3276,6 +3918,185 @@
     </w:lvl>
   </w:abstractNum>
   <w:abstractNum w:abstractNumId="2" w15:restartNumberingAfterBreak="0">
+    <w:nsid w:val="33A44C5C"/>
+    <w:multiLevelType w:val="hybridMultilevel"/>
+    <w:tmpl w:val="A1468796"/>
+    <w:lvl w:ilvl="0" w:tplc="0409000F">
+      <w:start w:val="1"/>
+      <w:numFmt w:val="decimal"/>
+      <w:lvlText w:val="%1."/>
+      <w:lvlJc w:val="left"/>
+      <w:pPr>
+        <w:ind w:left="720" w:hanging="360"/>
+      </w:pPr>
+      <w:rPr>
+        <w:rFonts w:hint="default"/>
+        <w:b w:val="0"/>
+      </w:rPr>
+    </w:lvl>
+    <w:lvl w:ilvl="1" w:tplc="04090019" w:tentative="1">
+      <w:start w:val="1"/>
+      <w:numFmt w:val="lowerLetter"/>
+      <w:lvlText w:val="%2."/>
+      <w:lvlJc w:val="left"/>
+      <w:pPr>
+        <w:ind w:left="1440" w:hanging="360"/>
+      </w:pPr>
+    </w:lvl>
+    <w:lvl w:ilvl="2" w:tplc="0409001B" w:tentative="1">
+      <w:start w:val="1"/>
+      <w:numFmt w:val="lowerRoman"/>
+      <w:lvlText w:val="%3."/>
+      <w:lvlJc w:val="right"/>
+      <w:pPr>
+        <w:ind w:left="2160" w:hanging="180"/>
+      </w:pPr>
+    </w:lvl>
+    <w:lvl w:ilvl="3" w:tplc="0409000F" w:tentative="1">
+      <w:start w:val="1"/>
+      <w:numFmt w:val="decimal"/>
+      <w:lvlText w:val="%4."/>
+      <w:lvlJc w:val="left"/>
+      <w:pPr>
+        <w:ind w:left="2880" w:hanging="360"/>
+      </w:pPr>
+    </w:lvl>
+    <w:lvl w:ilvl="4" w:tplc="04090019" w:tentative="1">
+      <w:start w:val="1"/>
+      <w:numFmt w:val="lowerLetter"/>
+      <w:lvlText w:val="%5."/>
+      <w:lvlJc w:val="left"/>
+      <w:pPr>
+        <w:ind w:left="3600" w:hanging="360"/>
+      </w:pPr>
+    </w:lvl>
+    <w:lvl w:ilvl="5" w:tplc="0409001B" w:tentative="1">
+      <w:start w:val="1"/>
+      <w:numFmt w:val="lowerRoman"/>
+      <w:lvlText w:val="%6."/>
+      <w:lvlJc w:val="right"/>
+      <w:pPr>
+        <w:ind w:left="4320" w:hanging="180"/>
+      </w:pPr>
+    </w:lvl>
+    <w:lvl w:ilvl="6" w:tplc="0409000F" w:tentative="1">
+      <w:start w:val="1"/>
+      <w:numFmt w:val="decimal"/>
+      <w:lvlText w:val="%7."/>
+      <w:lvlJc w:val="left"/>
+      <w:pPr>
+        <w:ind w:left="5040" w:hanging="360"/>
+      </w:pPr>
+    </w:lvl>
+    <w:lvl w:ilvl="7" w:tplc="04090019" w:tentative="1">
+      <w:start w:val="1"/>
+      <w:numFmt w:val="lowerLetter"/>
+      <w:lvlText w:val="%8."/>
+      <w:lvlJc w:val="left"/>
+      <w:pPr>
+        <w:ind w:left="5760" w:hanging="360"/>
+      </w:pPr>
+    </w:lvl>
+    <w:lvl w:ilvl="8" w:tplc="0409001B" w:tentative="1">
+      <w:start w:val="1"/>
+      <w:numFmt w:val="lowerRoman"/>
+      <w:lvlText w:val="%9."/>
+      <w:lvlJc w:val="right"/>
+      <w:pPr>
+        <w:ind w:left="6480" w:hanging="180"/>
+      </w:pPr>
+    </w:lvl>
+  </w:abstractNum>
+  <w:abstractNum w:abstractNumId="3" w15:restartNumberingAfterBreak="0">
+    <w:nsid w:val="47F307AE"/>
+    <w:multiLevelType w:val="hybridMultilevel"/>
+    <w:tmpl w:val="27B244C2"/>
+    <w:lvl w:ilvl="0" w:tplc="0409000F">
+      <w:start w:val="1"/>
+      <w:numFmt w:val="decimal"/>
+      <w:lvlText w:val="%1."/>
+      <w:lvlJc w:val="left"/>
+      <w:pPr>
+        <w:ind w:left="720" w:hanging="360"/>
+      </w:pPr>
+      <w:rPr>
+        <w:rFonts w:hint="default"/>
+      </w:rPr>
+    </w:lvl>
+    <w:lvl w:ilvl="1" w:tplc="04090019" w:tentative="1">
+      <w:start w:val="1"/>
+      <w:numFmt w:val="lowerLetter"/>
+      <w:lvlText w:val="%2."/>
+      <w:lvlJc w:val="left"/>
+      <w:pPr>
+        <w:ind w:left="1440" w:hanging="360"/>
+      </w:pPr>
+    </w:lvl>
+    <w:lvl w:ilvl="2" w:tplc="0409001B" w:tentative="1">
+      <w:start w:val="1"/>
+      <w:numFmt w:val="lowerRoman"/>
+      <w:lvlText w:val="%3."/>
+      <w:lvlJc w:val="right"/>
+      <w:pPr>
+        <w:ind w:left="2160" w:hanging="180"/>
+      </w:pPr>
+    </w:lvl>
+    <w:lvl w:ilvl="3" w:tplc="0409000F" w:tentative="1">
+      <w:start w:val="1"/>
+      <w:numFmt w:val="decimal"/>
+      <w:lvlText w:val="%4."/>
+      <w:lvlJc w:val="left"/>
+      <w:pPr>
+        <w:ind w:left="2880" w:hanging="360"/>
+      </w:pPr>
+    </w:lvl>
+    <w:lvl w:ilvl="4" w:tplc="04090019" w:tentative="1">
+      <w:start w:val="1"/>
+      <w:numFmt w:val="lowerLetter"/>
+      <w:lvlText w:val="%5."/>
+      <w:lvlJc w:val="left"/>
+      <w:pPr>
+        <w:ind w:left="3600" w:hanging="360"/>
+      </w:pPr>
+    </w:lvl>
+    <w:lvl w:ilvl="5" w:tplc="0409001B" w:tentative="1">
+      <w:start w:val="1"/>
+      <w:numFmt w:val="lowerRoman"/>
+      <w:lvlText w:val="%6."/>
+      <w:lvlJc w:val="right"/>
+      <w:pPr>
+        <w:ind w:left="4320" w:hanging="180"/>
+      </w:pPr>
+    </w:lvl>
+    <w:lvl w:ilvl="6" w:tplc="0409000F" w:tentative="1">
+      <w:start w:val="1"/>
+      <w:numFmt w:val="decimal"/>
+      <w:lvlText w:val="%7."/>
+      <w:lvlJc w:val="left"/>
+      <w:pPr>
+        <w:ind w:left="5040" w:hanging="360"/>
+      </w:pPr>
+    </w:lvl>
+    <w:lvl w:ilvl="7" w:tplc="04090019" w:tentative="1">
+      <w:start w:val="1"/>
+      <w:numFmt w:val="lowerLetter"/>
+      <w:lvlText w:val="%8."/>
+      <w:lvlJc w:val="left"/>
+      <w:pPr>
+        <w:ind w:left="5760" w:hanging="360"/>
+      </w:pPr>
+    </w:lvl>
+    <w:lvl w:ilvl="8" w:tplc="0409001B" w:tentative="1">
+      <w:start w:val="1"/>
+      <w:numFmt w:val="lowerRoman"/>
+      <w:lvlText w:val="%9."/>
+      <w:lvlJc w:val="right"/>
+      <w:pPr>
+        <w:ind w:left="6480" w:hanging="180"/>
+      </w:pPr>
+    </w:lvl>
+  </w:abstractNum>
+  <w:abstractNum w:abstractNumId="4" w15:restartNumberingAfterBreak="0">
     <w:nsid w:val="52611675"/>
     <w:multiLevelType w:val="hybridMultilevel"/>
     <w:tmpl w:val="EDD4A492"/>
@@ -3361,7 +4182,7 @@
       </w:pPr>
     </w:lvl>
   </w:abstractNum>
-  <w:abstractNum w:abstractNumId="3" w15:restartNumberingAfterBreak="0">
+  <w:abstractNum w:abstractNumId="5" w15:restartNumberingAfterBreak="0">
     <w:nsid w:val="61BB11DC"/>
     <w:multiLevelType w:val="hybridMultilevel"/>
     <w:tmpl w:val="7C10039A"/>
@@ -3451,7 +4272,185 @@
       </w:pPr>
     </w:lvl>
   </w:abstractNum>
-  <w:abstractNum w:abstractNumId="4" w15:restartNumberingAfterBreak="0">
+  <w:abstractNum w:abstractNumId="6" w15:restartNumberingAfterBreak="0">
+    <w:nsid w:val="70442270"/>
+    <w:multiLevelType w:val="hybridMultilevel"/>
+    <w:tmpl w:val="C14E5556"/>
+    <w:lvl w:ilvl="0" w:tplc="0409000F">
+      <w:start w:val="1"/>
+      <w:numFmt w:val="decimal"/>
+      <w:lvlText w:val="%1."/>
+      <w:lvlJc w:val="left"/>
+      <w:pPr>
+        <w:ind w:left="720" w:hanging="360"/>
+      </w:pPr>
+      <w:rPr>
+        <w:rFonts w:hint="default"/>
+      </w:rPr>
+    </w:lvl>
+    <w:lvl w:ilvl="1" w:tplc="04090019" w:tentative="1">
+      <w:start w:val="1"/>
+      <w:numFmt w:val="lowerLetter"/>
+      <w:lvlText w:val="%2."/>
+      <w:lvlJc w:val="left"/>
+      <w:pPr>
+        <w:ind w:left="1440" w:hanging="360"/>
+      </w:pPr>
+    </w:lvl>
+    <w:lvl w:ilvl="2" w:tplc="0409001B" w:tentative="1">
+      <w:start w:val="1"/>
+      <w:numFmt w:val="lowerRoman"/>
+      <w:lvlText w:val="%3."/>
+      <w:lvlJc w:val="right"/>
+      <w:pPr>
+        <w:ind w:left="2160" w:hanging="180"/>
+      </w:pPr>
+    </w:lvl>
+    <w:lvl w:ilvl="3" w:tplc="0409000F" w:tentative="1">
+      <w:start w:val="1"/>
+      <w:numFmt w:val="decimal"/>
+      <w:lvlText w:val="%4."/>
+      <w:lvlJc w:val="left"/>
+      <w:pPr>
+        <w:ind w:left="2880" w:hanging="360"/>
+      </w:pPr>
+    </w:lvl>
+    <w:lvl w:ilvl="4" w:tplc="04090019" w:tentative="1">
+      <w:start w:val="1"/>
+      <w:numFmt w:val="lowerLetter"/>
+      <w:lvlText w:val="%5."/>
+      <w:lvlJc w:val="left"/>
+      <w:pPr>
+        <w:ind w:left="3600" w:hanging="360"/>
+      </w:pPr>
+    </w:lvl>
+    <w:lvl w:ilvl="5" w:tplc="0409001B" w:tentative="1">
+      <w:start w:val="1"/>
+      <w:numFmt w:val="lowerRoman"/>
+      <w:lvlText w:val="%6."/>
+      <w:lvlJc w:val="right"/>
+      <w:pPr>
+        <w:ind w:left="4320" w:hanging="180"/>
+      </w:pPr>
+    </w:lvl>
+    <w:lvl w:ilvl="6" w:tplc="0409000F" w:tentative="1">
+      <w:start w:val="1"/>
+      <w:numFmt w:val="decimal"/>
+      <w:lvlText w:val="%7."/>
+      <w:lvlJc w:val="left"/>
+      <w:pPr>
+        <w:ind w:left="5040" w:hanging="360"/>
+      </w:pPr>
+    </w:lvl>
+    <w:lvl w:ilvl="7" w:tplc="04090019" w:tentative="1">
+      <w:start w:val="1"/>
+      <w:numFmt w:val="lowerLetter"/>
+      <w:lvlText w:val="%8."/>
+      <w:lvlJc w:val="left"/>
+      <w:pPr>
+        <w:ind w:left="5760" w:hanging="360"/>
+      </w:pPr>
+    </w:lvl>
+    <w:lvl w:ilvl="8" w:tplc="0409001B" w:tentative="1">
+      <w:start w:val="1"/>
+      <w:numFmt w:val="lowerRoman"/>
+      <w:lvlText w:val="%9."/>
+      <w:lvlJc w:val="right"/>
+      <w:pPr>
+        <w:ind w:left="6480" w:hanging="180"/>
+      </w:pPr>
+    </w:lvl>
+  </w:abstractNum>
+  <w:abstractNum w:abstractNumId="7" w15:restartNumberingAfterBreak="0">
+    <w:nsid w:val="75272BE1"/>
+    <w:multiLevelType w:val="hybridMultilevel"/>
+    <w:tmpl w:val="09F8AA0C"/>
+    <w:lvl w:ilvl="0" w:tplc="0409000F">
+      <w:start w:val="1"/>
+      <w:numFmt w:val="decimal"/>
+      <w:lvlText w:val="%1."/>
+      <w:lvlJc w:val="left"/>
+      <w:pPr>
+        <w:ind w:left="720" w:hanging="360"/>
+      </w:pPr>
+      <w:rPr>
+        <w:rFonts w:hint="default"/>
+      </w:rPr>
+    </w:lvl>
+    <w:lvl w:ilvl="1" w:tplc="04090019" w:tentative="1">
+      <w:start w:val="1"/>
+      <w:numFmt w:val="lowerLetter"/>
+      <w:lvlText w:val="%2."/>
+      <w:lvlJc w:val="left"/>
+      <w:pPr>
+        <w:ind w:left="1440" w:hanging="360"/>
+      </w:pPr>
+    </w:lvl>
+    <w:lvl w:ilvl="2" w:tplc="0409001B" w:tentative="1">
+      <w:start w:val="1"/>
+      <w:numFmt w:val="lowerRoman"/>
+      <w:lvlText w:val="%3."/>
+      <w:lvlJc w:val="right"/>
+      <w:pPr>
+        <w:ind w:left="2160" w:hanging="180"/>
+      </w:pPr>
+    </w:lvl>
+    <w:lvl w:ilvl="3" w:tplc="0409000F" w:tentative="1">
+      <w:start w:val="1"/>
+      <w:numFmt w:val="decimal"/>
+      <w:lvlText w:val="%4."/>
+      <w:lvlJc w:val="left"/>
+      <w:pPr>
+        <w:ind w:left="2880" w:hanging="360"/>
+      </w:pPr>
+    </w:lvl>
+    <w:lvl w:ilvl="4" w:tplc="04090019" w:tentative="1">
+      <w:start w:val="1"/>
+      <w:numFmt w:val="lowerLetter"/>
+      <w:lvlText w:val="%5."/>
+      <w:lvlJc w:val="left"/>
+      <w:pPr>
+        <w:ind w:left="3600" w:hanging="360"/>
+      </w:pPr>
+    </w:lvl>
+    <w:lvl w:ilvl="5" w:tplc="0409001B" w:tentative="1">
+      <w:start w:val="1"/>
+      <w:numFmt w:val="lowerRoman"/>
+      <w:lvlText w:val="%6."/>
+      <w:lvlJc w:val="right"/>
+      <w:pPr>
+        <w:ind w:left="4320" w:hanging="180"/>
+      </w:pPr>
+    </w:lvl>
+    <w:lvl w:ilvl="6" w:tplc="0409000F" w:tentative="1">
+      <w:start w:val="1"/>
+      <w:numFmt w:val="decimal"/>
+      <w:lvlText w:val="%7."/>
+      <w:lvlJc w:val="left"/>
+      <w:pPr>
+        <w:ind w:left="5040" w:hanging="360"/>
+      </w:pPr>
+    </w:lvl>
+    <w:lvl w:ilvl="7" w:tplc="04090019" w:tentative="1">
+      <w:start w:val="1"/>
+      <w:numFmt w:val="lowerLetter"/>
+      <w:lvlText w:val="%8."/>
+      <w:lvlJc w:val="left"/>
+      <w:pPr>
+        <w:ind w:left="5760" w:hanging="360"/>
+      </w:pPr>
+    </w:lvl>
+    <w:lvl w:ilvl="8" w:tplc="0409001B" w:tentative="1">
+      <w:start w:val="1"/>
+      <w:numFmt w:val="lowerRoman"/>
+      <w:lvlText w:val="%9."/>
+      <w:lvlJc w:val="right"/>
+      <w:pPr>
+        <w:ind w:left="6480" w:hanging="180"/>
+      </w:pPr>
+    </w:lvl>
+  </w:abstractNum>
+  <w:abstractNum w:abstractNumId="8" w15:restartNumberingAfterBreak="0">
     <w:nsid w:val="76AC7E6C"/>
     <w:multiLevelType w:val="hybridMultilevel"/>
     <w:tmpl w:val="A40AA83A"/>
@@ -3568,16 +4567,28 @@
     <w:abstractNumId w:val="1"/>
   </w:num>
   <w:num w:numId="2" w16cid:durableId="1339843216">
-    <w:abstractNumId w:val="4"/>
+    <w:abstractNumId w:val="8"/>
   </w:num>
   <w:num w:numId="3" w16cid:durableId="89549674">
     <w:abstractNumId w:val="0"/>
   </w:num>
   <w:num w:numId="4" w16cid:durableId="2010134716">
-    <w:abstractNumId w:val="2"/>
+    <w:abstractNumId w:val="4"/>
   </w:num>
   <w:num w:numId="5" w16cid:durableId="31227179">
+    <w:abstractNumId w:val="5"/>
+  </w:num>
+  <w:num w:numId="6" w16cid:durableId="1534685845">
+    <w:abstractNumId w:val="7"/>
+  </w:num>
+  <w:num w:numId="7" w16cid:durableId="1046374056">
     <w:abstractNumId w:val="3"/>
+  </w:num>
+  <w:num w:numId="8" w16cid:durableId="1260724421">
+    <w:abstractNumId w:val="6"/>
+  </w:num>
+  <w:num w:numId="9" w16cid:durableId="1954969753">
+    <w:abstractNumId w:val="2"/>
   </w:num>
 </w:numbering>
 </file>
@@ -4011,7 +5022,6 @@
     <w:next w:val="Normal"/>
     <w:link w:val="Heading2Char"/>
     <w:uiPriority w:val="9"/>
-    <w:semiHidden/>
     <w:unhideWhenUsed/>
     <w:qFormat/>
     <w:rsid w:val="000A1A2F"/>
@@ -4186,7 +5196,6 @@
   <w:style w:type="character" w:default="1" w:styleId="DefaultParagraphFont">
     <w:name w:val="Default Paragraph Font"/>
     <w:uiPriority w:val="1"/>
-    <w:semiHidden/>
     <w:unhideWhenUsed/>
   </w:style>
   <w:style w:type="table" w:default="1" w:styleId="TableNormal">
@@ -4228,7 +5237,6 @@
     <w:basedOn w:val="DefaultParagraphFont"/>
     <w:link w:val="Heading2"/>
     <w:uiPriority w:val="9"/>
-    <w:semiHidden/>
     <w:rsid w:val="000A1A2F"/>
     <w:rPr>
       <w:rFonts w:asciiTheme="majorHAnsi" w:eastAsiaTheme="majorEastAsia" w:hAnsiTheme="majorHAnsi" w:cstheme="majorBidi"/>

</xml_diff>

<commit_message>
added challenges stuff to the report but need to merge my pr to get pictures of challenges in slides
</commit_message>
<xml_diff>
--- a/Documentation/Weekly Report/week6/CMSC-4920-Week6Report-Group2.docx
+++ b/Documentation/Weekly Report/week6/CMSC-4920-Week6Report-Group2.docx
@@ -2037,31 +2037,7 @@
         <w:rPr>
           <w:rFonts w:ascii="Times New Roman" w:hAnsi="Times New Roman" w:cs="Times New Roman"/>
         </w:rPr>
-        <w:t>Several other features were clean up and</w:t>
-      </w:r>
-      <w:r>
-        <w:rPr>
-          <w:rFonts w:ascii="Times New Roman" w:hAnsi="Times New Roman" w:cs="Times New Roman"/>
-        </w:rPr>
-        <w:t>/</w:t>
-      </w:r>
-      <w:r>
-        <w:rPr>
-          <w:rFonts w:ascii="Times New Roman" w:hAnsi="Times New Roman" w:cs="Times New Roman"/>
-        </w:rPr>
-        <w:t xml:space="preserve">or added this week that fall into the category of minor front-end changes. For example, clubs that a user is a member of were finally displayed on the user’s dashboard panel. Here, name of club and overall member count can be </w:t>
-      </w:r>
-      <w:r>
-        <w:rPr>
-          <w:rFonts w:ascii="Times New Roman" w:hAnsi="Times New Roman" w:cs="Times New Roman"/>
-        </w:rPr>
-        <w:t xml:space="preserve">seen when mouse is hovered over. Another minor change was the </w:t>
-      </w:r>
-      <w:r>
-        <w:rPr>
-          <w:rFonts w:ascii="Times New Roman" w:hAnsi="Times New Roman" w:cs="Times New Roman"/>
-        </w:rPr>
-        <w:t>moving of leaderboard filters for clear navigation.</w:t>
+        <w:t>The fourth goal of week six was to begin on the development of the challenges page. The basic intial backend functionality was created to allow users to create challenges, including proper validation of required fields like a start and end date to the challenge. The initial API route has been created and connected to the frontend so that the challenge data can be successfully grabbed from the frontend and stored. The challenges page is still under development, but after the progress of this week some core functionality has been established.</w:t>
       </w:r>
     </w:p>
     <w:p>
@@ -2077,6 +2053,45 @@
           <w:rFonts w:ascii="Times New Roman" w:hAnsi="Times New Roman" w:cs="Times New Roman"/>
         </w:rPr>
         <w:lastRenderedPageBreak/>
+        <w:t>Several other features were clean up and</w:t>
+      </w:r>
+      <w:r>
+        <w:rPr>
+          <w:rFonts w:ascii="Times New Roman" w:hAnsi="Times New Roman" w:cs="Times New Roman"/>
+        </w:rPr>
+        <w:t>/</w:t>
+      </w:r>
+      <w:r>
+        <w:rPr>
+          <w:rFonts w:ascii="Times New Roman" w:hAnsi="Times New Roman" w:cs="Times New Roman"/>
+        </w:rPr>
+        <w:t xml:space="preserve">or added this week that fall into the category of minor front-end changes. For example, clubs that a user is a member of were finally displayed on the user’s dashboard panel. Here, name of club and overall member count can be </w:t>
+      </w:r>
+      <w:r>
+        <w:rPr>
+          <w:rFonts w:ascii="Times New Roman" w:hAnsi="Times New Roman" w:cs="Times New Roman"/>
+        </w:rPr>
+        <w:t xml:space="preserve">seen when mouse is hovered over. Another minor change was the </w:t>
+      </w:r>
+      <w:r>
+        <w:rPr>
+          <w:rFonts w:ascii="Times New Roman" w:hAnsi="Times New Roman" w:cs="Times New Roman"/>
+        </w:rPr>
+        <w:t>moving of leaderboard filters for clear navigation.</w:t>
+      </w:r>
+    </w:p>
+    <w:p>
+      <w:pPr>
+        <w:spacing w:line="480" w:lineRule="auto"/>
+        <w:ind w:firstLine="720"/>
+        <w:rPr>
+          <w:rFonts w:ascii="Times New Roman" w:hAnsi="Times New Roman" w:cs="Times New Roman"/>
+        </w:rPr>
+      </w:pPr>
+      <w:r>
+        <w:rPr>
+          <w:rFonts w:ascii="Times New Roman" w:hAnsi="Times New Roman" w:cs="Times New Roman"/>
+        </w:rPr>
         <w:t>T</w:t>
       </w:r>
       <w:r>
@@ -2457,6 +2472,7 @@
           <w:sz w:val="24"/>
           <w:szCs w:val="24"/>
         </w:rPr>
+        <w:lastRenderedPageBreak/>
         <w:t>Solutions:</w:t>
       </w:r>
       <w:bookmarkEnd w:id="3"/>
@@ -2521,14 +2537,7 @@
         <w:rPr>
           <w:rFonts w:ascii="Times New Roman" w:hAnsi="Times New Roman" w:cs="Times New Roman"/>
         </w:rPr>
-        <w:t xml:space="preserve"> by the user viewing it, if so, the user cannot click it again. However, if it has not been clicked, </w:t>
-      </w:r>
-      <w:r>
-        <w:rPr>
-          <w:rFonts w:ascii="Times New Roman" w:hAnsi="Times New Roman" w:cs="Times New Roman"/>
-        </w:rPr>
-        <w:lastRenderedPageBreak/>
-        <w:t>the user can use the like button, and their status is then sent across the API and stored in the database for future reference.</w:t>
+        <w:t xml:space="preserve"> by the user viewing it, if so, the user cannot click it again. However, if it has not been clicked, the user can use the like button, and their status is then sent across the API and stored in the database for future reference.</w:t>
       </w:r>
       <w:r>
         <w:rPr>
@@ -2588,31 +2597,7 @@
         <w:rPr>
           <w:rFonts w:ascii="Times New Roman" w:hAnsi="Times New Roman" w:cs="Times New Roman"/>
         </w:rPr>
-        <w:t xml:space="preserve">3. </w:t>
-      </w:r>
-      <w:r>
-        <w:rPr>
-          <w:rFonts w:ascii="Times New Roman" w:hAnsi="Times New Roman" w:cs="Times New Roman"/>
-        </w:rPr>
-        <w:t xml:space="preserve">Through group and class </w:t>
-      </w:r>
-      <w:r>
-        <w:rPr>
-          <w:rFonts w:ascii="Times New Roman" w:hAnsi="Times New Roman" w:cs="Times New Roman"/>
-        </w:rPr>
-        <w:t>decisions</w:t>
-      </w:r>
-      <w:r>
-        <w:rPr>
-          <w:rFonts w:ascii="Times New Roman" w:hAnsi="Times New Roman" w:cs="Times New Roman"/>
-        </w:rPr>
-        <w:t xml:space="preserve"> it was thought to be best to display the top ten </w:t>
-      </w:r>
-      <w:r>
-        <w:rPr>
-          <w:rFonts w:ascii="Times New Roman" w:hAnsi="Times New Roman" w:cs="Times New Roman"/>
-        </w:rPr>
-        <w:t>activi</w:t>
+        <w:t>3. Through group and class decisions it was thought to be best to display the top ten activi</w:t>
       </w:r>
       <w:r>
         <w:rPr>
@@ -2707,7 +2692,14 @@
         <w:rPr>
           <w:rFonts w:ascii="Times New Roman" w:hAnsi="Times New Roman" w:cs="Times New Roman"/>
         </w:rPr>
-        <w:t xml:space="preserve">Week 6 transformed the Vulcan Activity Tracker from concept to actuality. </w:t>
+        <w:t xml:space="preserve">Week 6 transformed the Vulcan Activity Tracker from concept to </w:t>
+      </w:r>
+      <w:r>
+        <w:rPr>
+          <w:rFonts w:ascii="Times New Roman" w:hAnsi="Times New Roman" w:cs="Times New Roman"/>
+        </w:rPr>
+        <w:lastRenderedPageBreak/>
+        <w:t xml:space="preserve">actuality. </w:t>
       </w:r>
       <w:r>
         <w:rPr>
@@ -2743,14 +2735,7 @@
         <w:rPr>
           <w:rFonts w:ascii="Times New Roman" w:hAnsi="Times New Roman" w:cs="Times New Roman"/>
         </w:rPr>
-        <w:t xml:space="preserve">the Teams, </w:t>
-      </w:r>
-      <w:r>
-        <w:rPr>
-          <w:rFonts w:ascii="Times New Roman" w:hAnsi="Times New Roman" w:cs="Times New Roman"/>
-        </w:rPr>
-        <w:lastRenderedPageBreak/>
-        <w:t>Maps, and Challenges Pages.</w:t>
+        <w:t>the Teams, Maps, and Challenges Pages.</w:t>
       </w:r>
       <w:r>
         <w:rPr>
@@ -2916,6 +2901,7 @@
           <w:sz w:val="24"/>
           <w:szCs w:val="24"/>
         </w:rPr>
+        <w:lastRenderedPageBreak/>
         <w:t>Current Dashboard Progress:</w:t>
       </w:r>
       <w:bookmarkEnd w:id="6"/>
@@ -2935,6 +2921,7 @@
           <w:rFonts w:ascii="Times New Roman" w:hAnsi="Times New Roman" w:cs="Times New Roman"/>
           <w:b/>
           <w:bCs/>
+          <w:noProof/>
         </w:rPr>
         <w:drawing>
           <wp:inline distT="0" distB="0" distL="0" distR="0" wp14:anchorId="0D90401C" wp14:editId="00AE6632">
@@ -3015,7 +3002,6 @@
           <w:sz w:val="24"/>
           <w:szCs w:val="24"/>
         </w:rPr>
-        <w:lastRenderedPageBreak/>
         <w:t xml:space="preserve">Week </w:t>
       </w:r>
       <w:r>
@@ -5196,6 +5182,7 @@
   <w:style w:type="character" w:default="1" w:styleId="DefaultParagraphFont">
     <w:name w:val="Default Paragraph Font"/>
     <w:uiPriority w:val="1"/>
+    <w:semiHidden/>
     <w:unhideWhenUsed/>
   </w:style>
   <w:style w:type="table" w:default="1" w:styleId="TableNormal">

</xml_diff>

<commit_message>
typo error in clubdetails
</commit_message>
<xml_diff>
--- a/Documentation/Weekly Report/week6/CMSC-4920-Week6Report-Group2.docx
+++ b/Documentation/Weekly Report/week6/CMSC-4920-Week6Report-Group2.docx
@@ -2037,7 +2037,21 @@
         <w:rPr>
           <w:rFonts w:ascii="Times New Roman" w:hAnsi="Times New Roman" w:cs="Times New Roman"/>
         </w:rPr>
-        <w:t>The fourth goal of week six was to begin on the development of the challenges page. The basic intial backend functionality was created to allow users to create challenges, including proper validation of required fields like a start and end date to the challenge. The initial API route has been created and connected to the frontend so that the challenge data can be successfully grabbed from the frontend and stored. The challenges page is still under development, but after the progress of this week some core functionality has been established.</w:t>
+        <w:t xml:space="preserve">The fourth goal of week six was to begin on the development of the challenges page. The basic </w:t>
+      </w:r>
+      <w:proofErr w:type="spellStart"/>
+      <w:r>
+        <w:rPr>
+          <w:rFonts w:ascii="Times New Roman" w:hAnsi="Times New Roman" w:cs="Times New Roman"/>
+        </w:rPr>
+        <w:t>intial</w:t>
+      </w:r>
+      <w:proofErr w:type="spellEnd"/>
+      <w:r>
+        <w:rPr>
+          <w:rFonts w:ascii="Times New Roman" w:hAnsi="Times New Roman" w:cs="Times New Roman"/>
+        </w:rPr>
+        <w:t xml:space="preserve"> backend functionality was created to allow users to create challenges, including proper validation of required fields like a start and end date to the challenge. The initial API route has been created and connected to the frontend so that the challenge data can be successfully grabbed from the frontend and stored. The challenges page is still under development, but after the progress of this week some core functionality has been established.</w:t>
       </w:r>
     </w:p>
     <w:p>
@@ -2053,6 +2067,47 @@
           <w:rFonts w:ascii="Times New Roman" w:hAnsi="Times New Roman" w:cs="Times New Roman"/>
         </w:rPr>
         <w:lastRenderedPageBreak/>
+        <w:t xml:space="preserve">A big feature not in our goals list was the addition of user email to the database. When creating an account, user’s are now prompted to enter a </w:t>
+      </w:r>
+      <w:proofErr w:type="spellStart"/>
+      <w:r>
+        <w:rPr>
+          <w:rFonts w:ascii="Times New Roman" w:hAnsi="Times New Roman" w:cs="Times New Roman"/>
+        </w:rPr>
+        <w:t>PennWest</w:t>
+      </w:r>
+      <w:proofErr w:type="spellEnd"/>
+      <w:r>
+        <w:rPr>
+          <w:rFonts w:ascii="Times New Roman" w:hAnsi="Times New Roman" w:cs="Times New Roman"/>
+        </w:rPr>
+        <w:t xml:space="preserve"> email address. </w:t>
+      </w:r>
+      <w:r>
+        <w:rPr>
+          <w:rFonts w:ascii="Times New Roman" w:hAnsi="Times New Roman" w:cs="Times New Roman"/>
+        </w:rPr>
+        <w:t xml:space="preserve">The site will not accept an email without the @pennwest.edu extension. Once the user enters correct </w:t>
+      </w:r>
+      <w:r>
+        <w:rPr>
+          <w:rFonts w:ascii="Times New Roman" w:hAnsi="Times New Roman" w:cs="Times New Roman"/>
+        </w:rPr>
+        <w:t>information, the email is placed into the database.</w:t>
+      </w:r>
+    </w:p>
+    <w:p>
+      <w:pPr>
+        <w:spacing w:line="480" w:lineRule="auto"/>
+        <w:ind w:firstLine="720"/>
+        <w:rPr>
+          <w:rFonts w:ascii="Times New Roman" w:hAnsi="Times New Roman" w:cs="Times New Roman"/>
+        </w:rPr>
+      </w:pPr>
+      <w:r>
+        <w:rPr>
+          <w:rFonts w:ascii="Times New Roman" w:hAnsi="Times New Roman" w:cs="Times New Roman"/>
+        </w:rPr>
         <w:t>Several other features were clean up and</w:t>
       </w:r>
       <w:r>
@@ -2441,6 +2496,7 @@
         <w:rPr>
           <w:rFonts w:ascii="Times New Roman" w:hAnsi="Times New Roman" w:cs="Times New Roman"/>
         </w:rPr>
+        <w:lastRenderedPageBreak/>
         <w:t xml:space="preserve">3. Another challenge of this week was finding a solution to viewing activities both on the friend and user features. Once many activities were stored the list became so long and </w:t>
       </w:r>
       <w:r>
@@ -2448,6 +2504,51 @@
           <w:rFonts w:ascii="Times New Roman" w:hAnsi="Times New Roman" w:cs="Times New Roman"/>
         </w:rPr>
         <w:t xml:space="preserve">resulted in a strange UI effect. </w:t>
+      </w:r>
+    </w:p>
+    <w:p>
+      <w:pPr>
+        <w:spacing w:line="480" w:lineRule="auto"/>
+        <w:rPr>
+          <w:rFonts w:ascii="Times New Roman" w:hAnsi="Times New Roman" w:cs="Times New Roman"/>
+        </w:rPr>
+      </w:pPr>
+      <w:r>
+        <w:rPr>
+          <w:rFonts w:ascii="Times New Roman" w:hAnsi="Times New Roman" w:cs="Times New Roman"/>
+        </w:rPr>
+        <w:tab/>
+        <w:t>4</w:t>
+      </w:r>
+      <w:r>
+        <w:rPr>
+          <w:rFonts w:ascii="Times New Roman" w:hAnsi="Times New Roman" w:cs="Times New Roman"/>
+        </w:rPr>
+        <w:t>. Email</w:t>
+      </w:r>
+      <w:r>
+        <w:rPr>
+          <w:rFonts w:ascii="Times New Roman" w:hAnsi="Times New Roman" w:cs="Times New Roman"/>
+        </w:rPr>
+        <w:t xml:space="preserve"> proves to be a challenge, we struggled to </w:t>
+      </w:r>
+      <w:r>
+        <w:rPr>
+          <w:rFonts w:ascii="Times New Roman" w:hAnsi="Times New Roman" w:cs="Times New Roman"/>
+        </w:rPr>
+        <w:t>figure out a good way to send a verification or password recovery email</w:t>
+      </w:r>
+      <w:r>
+        <w:rPr>
+          <w:rFonts w:ascii="Times New Roman" w:hAnsi="Times New Roman" w:cs="Times New Roman"/>
+        </w:rPr>
+        <w:t xml:space="preserve">. </w:t>
+      </w:r>
+      <w:r>
+        <w:rPr>
+          <w:rFonts w:ascii="Times New Roman" w:hAnsi="Times New Roman" w:cs="Times New Roman"/>
+        </w:rPr>
+        <w:t>Since the email was a spontaneous addition to the project, we didn’t have a great way of approaching the next steps to this task, other than to encrypt the email in the database.</w:t>
       </w:r>
     </w:p>
     <w:p>
@@ -2472,7 +2573,6 @@
           <w:sz w:val="24"/>
           <w:szCs w:val="24"/>
         </w:rPr>
-        <w:lastRenderedPageBreak/>
         <w:t>Solutions:</w:t>
       </w:r>
       <w:bookmarkEnd w:id="3"/>
@@ -2603,7 +2703,21 @@
         <w:rPr>
           <w:rFonts w:ascii="Times New Roman" w:hAnsi="Times New Roman" w:cs="Times New Roman"/>
         </w:rPr>
-        <w:t xml:space="preserve">ties for the dashboard ands friend view. This keeps the UI </w:t>
+        <w:t xml:space="preserve">ties for the dashboard </w:t>
+      </w:r>
+      <w:proofErr w:type="spellStart"/>
+      <w:r>
+        <w:rPr>
+          <w:rFonts w:ascii="Times New Roman" w:hAnsi="Times New Roman" w:cs="Times New Roman"/>
+        </w:rPr>
+        <w:t>ands</w:t>
+      </w:r>
+      <w:proofErr w:type="spellEnd"/>
+      <w:r>
+        <w:rPr>
+          <w:rFonts w:ascii="Times New Roman" w:hAnsi="Times New Roman" w:cs="Times New Roman"/>
+        </w:rPr>
+        <w:t xml:space="preserve"> friend view. This keeps the UI </w:t>
       </w:r>
       <w:r>
         <w:rPr>
@@ -2615,7 +2729,14 @@
         <w:rPr>
           <w:rFonts w:ascii="Times New Roman" w:hAnsi="Times New Roman" w:cs="Times New Roman"/>
         </w:rPr>
-        <w:t xml:space="preserve"> and doesn’t overload the page view. </w:t>
+        <w:t xml:space="preserve"> and doesn’t overload the </w:t>
+      </w:r>
+      <w:r>
+        <w:rPr>
+          <w:rFonts w:ascii="Times New Roman" w:hAnsi="Times New Roman" w:cs="Times New Roman"/>
+        </w:rPr>
+        <w:lastRenderedPageBreak/>
+        <w:t xml:space="preserve">page view. </w:t>
       </w:r>
       <w:r>
         <w:rPr>
@@ -2640,6 +2761,21 @@
           <w:rFonts w:ascii="Times New Roman" w:hAnsi="Times New Roman" w:cs="Times New Roman"/>
         </w:rPr>
         <w:t>. This ensures that every time a user views their activities they are looking at up to date information.</w:t>
+      </w:r>
+    </w:p>
+    <w:p>
+      <w:pPr>
+        <w:spacing w:line="480" w:lineRule="auto"/>
+        <w:ind w:firstLine="720"/>
+        <w:rPr>
+          <w:rFonts w:ascii="Times New Roman" w:hAnsi="Times New Roman" w:cs="Times New Roman"/>
+        </w:rPr>
+      </w:pPr>
+      <w:r>
+        <w:rPr>
+          <w:rFonts w:ascii="Times New Roman" w:hAnsi="Times New Roman" w:cs="Times New Roman"/>
+        </w:rPr>
+        <w:t>4. While not solution for the email was found this week, we plan to continue researching and trying to get a way for email’s to play a bigger role in the Vulcan Activity Tracker.</w:t>
       </w:r>
     </w:p>
     <w:p>
@@ -2692,20 +2828,25 @@
         <w:rPr>
           <w:rFonts w:ascii="Times New Roman" w:hAnsi="Times New Roman" w:cs="Times New Roman"/>
         </w:rPr>
-        <w:t xml:space="preserve">Week 6 transformed the Vulcan Activity Tracker from concept to </w:t>
-      </w:r>
-      <w:r>
-        <w:rPr>
-          <w:rFonts w:ascii="Times New Roman" w:hAnsi="Times New Roman" w:cs="Times New Roman"/>
-        </w:rPr>
-        <w:lastRenderedPageBreak/>
-        <w:t xml:space="preserve">actuality. </w:t>
-      </w:r>
-      <w:r>
-        <w:rPr>
-          <w:rFonts w:ascii="Times New Roman" w:hAnsi="Times New Roman" w:cs="Times New Roman"/>
-        </w:rPr>
-        <w:t xml:space="preserve">Almost all main components have been initialized or are under development. As progress continues, our team is able to make modifications based on </w:t>
+        <w:t xml:space="preserve">Week 6 transformed the Vulcan Activity Tracker from concept to actuality. </w:t>
+      </w:r>
+      <w:r>
+        <w:rPr>
+          <w:rFonts w:ascii="Times New Roman" w:hAnsi="Times New Roman" w:cs="Times New Roman"/>
+        </w:rPr>
+        <w:t xml:space="preserve">Almost all main components have been initialized or are under development. As progress continues, our team </w:t>
+      </w:r>
+      <w:r>
+        <w:rPr>
+          <w:rFonts w:ascii="Times New Roman" w:hAnsi="Times New Roman" w:cs="Times New Roman"/>
+        </w:rPr>
+        <w:t>can</w:t>
+      </w:r>
+      <w:r>
+        <w:rPr>
+          <w:rFonts w:ascii="Times New Roman" w:hAnsi="Times New Roman" w:cs="Times New Roman"/>
+        </w:rPr>
+        <w:t xml:space="preserve"> make modifications based on </w:t>
       </w:r>
       <w:r>
         <w:rPr>
@@ -2771,7 +2912,31 @@
         <w:rPr>
           <w:rFonts w:ascii="Times New Roman" w:hAnsi="Times New Roman" w:cs="Times New Roman"/>
         </w:rPr>
-        <w:t xml:space="preserve">. Conversions from local databasing to cloud hosted </w:t>
+        <w:t xml:space="preserve">. Conversions from local </w:t>
+      </w:r>
+      <w:r>
+        <w:rPr>
+          <w:rFonts w:ascii="Times New Roman" w:hAnsi="Times New Roman" w:cs="Times New Roman"/>
+        </w:rPr>
+        <w:t>databases</w:t>
+      </w:r>
+      <w:r>
+        <w:rPr>
+          <w:rFonts w:ascii="Times New Roman" w:hAnsi="Times New Roman" w:cs="Times New Roman"/>
+        </w:rPr>
+        <w:t xml:space="preserve"> to </w:t>
+      </w:r>
+      <w:r>
+        <w:rPr>
+          <w:rFonts w:ascii="Times New Roman" w:hAnsi="Times New Roman" w:cs="Times New Roman"/>
+        </w:rPr>
+        <w:t>cloud-hosted</w:t>
+      </w:r>
+      <w:r>
+        <w:rPr>
+          <w:rFonts w:ascii="Times New Roman" w:hAnsi="Times New Roman" w:cs="Times New Roman"/>
+        </w:rPr>
+        <w:t xml:space="preserve"> </w:t>
       </w:r>
       <w:r>
         <w:rPr>
@@ -2783,7 +2948,19 @@
         <w:rPr>
           <w:rFonts w:ascii="Times New Roman" w:hAnsi="Times New Roman" w:cs="Times New Roman"/>
         </w:rPr>
-        <w:t>The following Gantt Chart image shows current progress of the Vulcan Activity Tracker timeline.</w:t>
+        <w:t xml:space="preserve">The following Gantt Chart image shows </w:t>
+      </w:r>
+      <w:r>
+        <w:rPr>
+          <w:rFonts w:ascii="Times New Roman" w:hAnsi="Times New Roman" w:cs="Times New Roman"/>
+        </w:rPr>
+        <w:t xml:space="preserve">the </w:t>
+      </w:r>
+      <w:r>
+        <w:rPr>
+          <w:rFonts w:ascii="Times New Roman" w:hAnsi="Times New Roman" w:cs="Times New Roman"/>
+        </w:rPr>
+        <w:t>current progress of the Vulcan Activity Tracker timeline.</w:t>
       </w:r>
     </w:p>
     <w:p>
@@ -2809,6 +2986,7 @@
           <w:sz w:val="24"/>
           <w:szCs w:val="24"/>
         </w:rPr>
+        <w:lastRenderedPageBreak/>
         <w:t>Gantt Chart:</w:t>
       </w:r>
       <w:bookmarkEnd w:id="5"/>
@@ -2901,7 +3079,6 @@
           <w:sz w:val="24"/>
           <w:szCs w:val="24"/>
         </w:rPr>
-        <w:lastRenderedPageBreak/>
         <w:t>Current Dashboard Progress:</w:t>
       </w:r>
       <w:bookmarkEnd w:id="6"/>
@@ -3081,7 +3258,14 @@
         <w:rPr>
           <w:rFonts w:ascii="Times New Roman" w:hAnsi="Times New Roman" w:cs="Times New Roman"/>
         </w:rPr>
-        <w:t xml:space="preserve">We have identified that our team additionally needs to hold a meeting for initial </w:t>
+        <w:t xml:space="preserve">We have identified that our team </w:t>
+      </w:r>
+      <w:r>
+        <w:rPr>
+          <w:rFonts w:ascii="Times New Roman" w:hAnsi="Times New Roman" w:cs="Times New Roman"/>
+        </w:rPr>
+        <w:lastRenderedPageBreak/>
+        <w:t xml:space="preserve">additionally needs to hold a meeting for initial </w:t>
       </w:r>
       <w:r>
         <w:rPr>

</xml_diff>